<commit_message>
Regenerate DOCX templates from specification images
Agent-Logs-Url: https://github.com/wkybill/process/sessions/40676494-2324-4dab-b26b-29b0fc2458e8

Co-authored-by: wkybill <151885169+wkybill@users.noreply.github.com>
</commit_message>
<xml_diff>
--- a/本科毕业论文任务书.docx
+++ b/本科毕业论文任务书.docx
@@ -4,1292 +4,92 @@
   <w:body>
     <w:p>
       <w:pPr>
-        <w:spacing w:before="0" w:after="0" w:line="300" w:lineRule="auto"/>
+        <w:spacing w:before="0" w:after="0" w:line="240" w:lineRule="auto"/>
         <w:jc w:val="center"/>
       </w:pPr>
       <w:r>
-        <w:rPr>
-          <w:rFonts w:ascii="黑体" w:hAnsi="黑体" w:eastAsia="黑体"/>
-          <w:b/>
-          <w:sz w:val="36"/>
-        </w:rPr>
-        <w:t>本科毕业论文（设计）任务书</w:t>
+        <w:drawing>
+          <wp:inline xmlns:a="http://schemas.openxmlformats.org/drawingml/2006/main" xmlns:pic="http://schemas.openxmlformats.org/drawingml/2006/picture">
+            <wp:extent cx="7560000" cy="9668077"/>
+            <wp:docPr id="1" name="Picture 1"/>
+            <wp:cNvGraphicFramePr>
+              <a:graphicFrameLocks noChangeAspect="1"/>
+            </wp:cNvGraphicFramePr>
+            <a:graphic>
+              <a:graphicData uri="http://schemas.openxmlformats.org/drawingml/2006/picture">
+                <pic:pic>
+                  <pic:nvPicPr>
+                    <pic:cNvPr id="0" name="page_17_xref_88.jpeg"/>
+                    <pic:cNvPicPr/>
+                  </pic:nvPicPr>
+                  <pic:blipFill>
+                    <a:blip r:embed="rId9"/>
+                    <a:stretch>
+                      <a:fillRect/>
+                    </a:stretch>
+                  </pic:blipFill>
+                  <pic:spPr>
+                    <a:xfrm>
+                      <a:off x="0" y="0"/>
+                      <a:ext cx="7560000" cy="9668077"/>
+                    </a:xfrm>
+                    <a:prstGeom prst="rect"/>
+                  </pic:spPr>
+                </pic:pic>
+              </a:graphicData>
+            </a:graphic>
+          </wp:inline>
+        </w:drawing>
       </w:r>
     </w:p>
-    <w:p/>
-    <w:tbl>
-      <w:tblPr>
-        <w:tblStyle w:val="TableGrid"/>
-        <w:tblW w:type="auto" w:w="0"/>
-        <w:jc w:val="center"/>
-        <w:tblLook w:firstColumn="1" w:firstRow="1" w:lastColumn="0" w:lastRow="0" w:noHBand="0" w:noVBand="1" w:val="04A0"/>
-      </w:tblPr>
-      <w:tblGrid>
-        <w:gridCol w:w="1531"/>
-        <w:gridCol w:w="1531"/>
-        <w:gridCol w:w="1531"/>
-        <w:gridCol w:w="1531"/>
-        <w:gridCol w:w="1531"/>
-        <w:gridCol w:w="1531"/>
-      </w:tblGrid>
-      <w:tr>
-        <w:tc>
-          <w:tcPr>
-            <w:tcW w:type="dxa" w:w="8447"/>
-            <w:gridSpan w:val="6"/>
-            <w:vAlign w:val="center"/>
-          </w:tcPr>
-          <w:p>
-            <w:pPr>
-              <w:jc w:val="center"/>
-            </w:pPr>
-            <w:r/>
-            <w:r>
-              <w:rPr>
-                <w:rFonts w:ascii="宋体" w:hAnsi="宋体" w:eastAsia="宋体"/>
-                <w:b w:val="0"/>
-                <w:sz w:val="22"/>
-              </w:rPr>
-              <w:t>论文（设计）题目</w:t>
-            </w:r>
-          </w:p>
-          <w:p>
-            <w:pPr>
-              <w:jc w:val="left"/>
-            </w:pPr>
-            <w:r/>
-            <w:r>
-              <w:rPr>
-                <w:rFonts w:ascii="宋体" w:hAnsi="宋体" w:eastAsia="宋体"/>
-                <w:b w:val="0"/>
-                <w:sz w:val="22"/>
-              </w:rPr>
-            </w:r>
-          </w:p>
-          <w:p>
-            <w:pPr>
-              <w:jc w:val="left"/>
-            </w:pPr>
-            <w:r/>
-            <w:r>
-              <w:rPr>
-                <w:rFonts w:ascii="宋体" w:hAnsi="宋体" w:eastAsia="宋体"/>
-                <w:b w:val="0"/>
-                <w:sz w:val="22"/>
-              </w:rPr>
-            </w:r>
-          </w:p>
-          <w:p>
-            <w:pPr>
-              <w:jc w:val="left"/>
-            </w:pPr>
-            <w:r/>
-            <w:r>
-              <w:rPr>
-                <w:rFonts w:ascii="宋体" w:hAnsi="宋体" w:eastAsia="宋体"/>
-                <w:b w:val="0"/>
-                <w:sz w:val="22"/>
-              </w:rPr>
-            </w:r>
-          </w:p>
-          <w:p>
-            <w:pPr>
-              <w:jc w:val="left"/>
-            </w:pPr>
-            <w:r/>
-            <w:r>
-              <w:rPr>
-                <w:rFonts w:ascii="宋体" w:hAnsi="宋体" w:eastAsia="宋体"/>
-                <w:b w:val="0"/>
-                <w:sz w:val="22"/>
-              </w:rPr>
-            </w:r>
-          </w:p>
-          <w:p>
-            <w:pPr>
-              <w:jc w:val="left"/>
-            </w:pPr>
-            <w:r/>
-            <w:r>
-              <w:rPr>
-                <w:rFonts w:ascii="宋体" w:hAnsi="宋体" w:eastAsia="宋体"/>
-                <w:b w:val="0"/>
-                <w:sz w:val="22"/>
-              </w:rPr>
-            </w:r>
-          </w:p>
-        </w:tc>
-      </w:tr>
-      <w:tr>
-        <w:tc>
-          <w:tcPr>
-            <w:tcW w:type="dxa" w:w="1247"/>
-            <w:vAlign w:val="center"/>
-            <w:shd w:fill="F2F2F2"/>
-          </w:tcPr>
-          <w:p>
-            <w:pPr>
-              <w:jc w:val="center"/>
-            </w:pPr>
-            <w:r/>
-            <w:r>
-              <w:rPr>
-                <w:rFonts w:ascii="宋体" w:hAnsi="宋体" w:eastAsia="宋体"/>
-                <w:b w:val="0"/>
-                <w:sz w:val="22"/>
-              </w:rPr>
-              <w:t>学生姓名</w:t>
-            </w:r>
-          </w:p>
-        </w:tc>
-        <w:tc>
-          <w:tcPr>
-            <w:tcW w:type="dxa" w:w="1644"/>
-            <w:vAlign w:val="center"/>
-          </w:tcPr>
-          <w:p>
-            <w:pPr>
-              <w:jc w:val="left"/>
-            </w:pPr>
-            <w:r/>
-            <w:r>
-              <w:rPr>
-                <w:rFonts w:ascii="宋体" w:hAnsi="宋体" w:eastAsia="宋体"/>
-                <w:b w:val="0"/>
-                <w:sz w:val="22"/>
-              </w:rPr>
-            </w:r>
-          </w:p>
-        </w:tc>
-        <w:tc>
-          <w:tcPr>
-            <w:tcW w:type="dxa" w:w="1134"/>
-            <w:vAlign w:val="center"/>
-            <w:shd w:fill="F2F2F2"/>
-          </w:tcPr>
-          <w:p>
-            <w:pPr>
-              <w:jc w:val="center"/>
-            </w:pPr>
-            <w:r/>
-            <w:r>
-              <w:rPr>
-                <w:rFonts w:ascii="宋体" w:hAnsi="宋体" w:eastAsia="宋体"/>
-                <w:b w:val="0"/>
-                <w:sz w:val="22"/>
-              </w:rPr>
-              <w:t>学号</w:t>
-            </w:r>
-          </w:p>
-        </w:tc>
-        <w:tc>
-          <w:tcPr>
-            <w:tcW w:type="dxa" w:w="1644"/>
-            <w:vAlign w:val="center"/>
-          </w:tcPr>
-          <w:p>
-            <w:pPr>
-              <w:jc w:val="left"/>
-            </w:pPr>
-            <w:r/>
-            <w:r>
-              <w:rPr>
-                <w:rFonts w:ascii="宋体" w:hAnsi="宋体" w:eastAsia="宋体"/>
-                <w:b w:val="0"/>
-                <w:sz w:val="22"/>
-              </w:rPr>
-            </w:r>
-          </w:p>
-        </w:tc>
-        <w:tc>
-          <w:tcPr>
-            <w:tcW w:type="dxa" w:w="1134"/>
-            <w:vAlign w:val="center"/>
-            <w:shd w:fill="F2F2F2"/>
-          </w:tcPr>
-          <w:p>
-            <w:pPr>
-              <w:jc w:val="center"/>
-            </w:pPr>
-            <w:r/>
-            <w:r>
-              <w:rPr>
-                <w:rFonts w:ascii="宋体" w:hAnsi="宋体" w:eastAsia="宋体"/>
-                <w:b w:val="0"/>
-                <w:sz w:val="22"/>
-              </w:rPr>
-              <w:t>专业班级</w:t>
-            </w:r>
-          </w:p>
-        </w:tc>
-        <w:tc>
-          <w:tcPr>
-            <w:tcW w:type="dxa" w:w="1644"/>
-            <w:vAlign w:val="center"/>
-          </w:tcPr>
-          <w:p>
-            <w:pPr>
-              <w:jc w:val="left"/>
-            </w:pPr>
-            <w:r/>
-            <w:r>
-              <w:rPr>
-                <w:rFonts w:ascii="宋体" w:hAnsi="宋体" w:eastAsia="宋体"/>
-                <w:b w:val="0"/>
-                <w:sz w:val="22"/>
-              </w:rPr>
-            </w:r>
-          </w:p>
-        </w:tc>
-      </w:tr>
-      <w:tr>
-        <w:tc>
-          <w:tcPr>
-            <w:tcW w:type="dxa" w:w="1247"/>
-            <w:vAlign w:val="center"/>
-            <w:shd w:fill="F2F2F2"/>
-          </w:tcPr>
-          <w:p>
-            <w:pPr>
-              <w:jc w:val="center"/>
-            </w:pPr>
-            <w:r/>
-            <w:r>
-              <w:rPr>
-                <w:rFonts w:ascii="宋体" w:hAnsi="宋体" w:eastAsia="宋体"/>
-                <w:b w:val="0"/>
-                <w:sz w:val="22"/>
-              </w:rPr>
-              <w:t>学院</w:t>
-            </w:r>
-          </w:p>
-        </w:tc>
-        <w:tc>
-          <w:tcPr>
-            <w:tcW w:type="dxa" w:w="1644"/>
-            <w:vAlign w:val="center"/>
-          </w:tcPr>
-          <w:p>
-            <w:pPr>
-              <w:jc w:val="left"/>
-            </w:pPr>
-            <w:r/>
-            <w:r>
-              <w:rPr>
-                <w:rFonts w:ascii="宋体" w:hAnsi="宋体" w:eastAsia="宋体"/>
-                <w:b w:val="0"/>
-                <w:sz w:val="22"/>
-              </w:rPr>
-            </w:r>
-          </w:p>
-        </w:tc>
-        <w:tc>
-          <w:tcPr>
-            <w:tcW w:type="dxa" w:w="1134"/>
-            <w:vAlign w:val="center"/>
-            <w:shd w:fill="F2F2F2"/>
-          </w:tcPr>
-          <w:p>
-            <w:pPr>
-              <w:jc w:val="center"/>
-            </w:pPr>
-            <w:r/>
-            <w:r>
-              <w:rPr>
-                <w:rFonts w:ascii="宋体" w:hAnsi="宋体" w:eastAsia="宋体"/>
-                <w:b w:val="0"/>
-                <w:sz w:val="22"/>
-              </w:rPr>
-              <w:t>指导教师</w:t>
-            </w:r>
-          </w:p>
-        </w:tc>
-        <w:tc>
-          <w:tcPr>
-            <w:tcW w:type="dxa" w:w="1644"/>
-            <w:vAlign w:val="center"/>
-          </w:tcPr>
-          <w:p>
-            <w:pPr>
-              <w:jc w:val="left"/>
-            </w:pPr>
-            <w:r/>
-            <w:r>
-              <w:rPr>
-                <w:rFonts w:ascii="宋体" w:hAnsi="宋体" w:eastAsia="宋体"/>
-                <w:b w:val="0"/>
-                <w:sz w:val="22"/>
-              </w:rPr>
-            </w:r>
-          </w:p>
-        </w:tc>
-        <w:tc>
-          <w:tcPr>
-            <w:tcW w:type="dxa" w:w="1134"/>
-            <w:vAlign w:val="center"/>
-            <w:shd w:fill="F2F2F2"/>
-          </w:tcPr>
-          <w:p>
-            <w:pPr>
-              <w:jc w:val="center"/>
-            </w:pPr>
-            <w:r/>
-            <w:r>
-              <w:rPr>
-                <w:rFonts w:ascii="宋体" w:hAnsi="宋体" w:eastAsia="宋体"/>
-                <w:b w:val="0"/>
-                <w:sz w:val="22"/>
-              </w:rPr>
-              <w:t>职称</w:t>
-            </w:r>
-          </w:p>
-        </w:tc>
-        <w:tc>
-          <w:tcPr>
-            <w:tcW w:type="dxa" w:w="1644"/>
-            <w:vAlign w:val="center"/>
-          </w:tcPr>
-          <w:p>
-            <w:pPr>
-              <w:jc w:val="left"/>
-            </w:pPr>
-            <w:r/>
-            <w:r>
-              <w:rPr>
-                <w:rFonts w:ascii="宋体" w:hAnsi="宋体" w:eastAsia="宋体"/>
-                <w:b w:val="0"/>
-                <w:sz w:val="22"/>
-              </w:rPr>
-            </w:r>
-          </w:p>
-        </w:tc>
-      </w:tr>
-      <w:tr>
-        <w:tc>
-          <w:tcPr>
-            <w:tcW w:type="dxa" w:w="8447"/>
-            <w:gridSpan w:val="6"/>
-            <w:vAlign w:val="center"/>
-            <w:shd w:fill="F2F2F2"/>
-          </w:tcPr>
-          <w:p>
-            <w:pPr>
-              <w:jc w:val="left"/>
-            </w:pPr>
-            <w:r/>
-            <w:r>
-              <w:rPr>
-                <w:rFonts w:ascii="宋体" w:hAnsi="宋体" w:eastAsia="宋体"/>
-                <w:b w:val="0"/>
-                <w:sz w:val="22"/>
-              </w:rPr>
-              <w:t>一、主要任务与目标</w:t>
-            </w:r>
-          </w:p>
-          <w:p>
-            <w:pPr>
-              <w:jc w:val="left"/>
-            </w:pPr>
-            <w:r/>
-            <w:r>
-              <w:rPr>
-                <w:rFonts w:ascii="宋体" w:hAnsi="宋体" w:eastAsia="宋体"/>
-                <w:b w:val="0"/>
-                <w:sz w:val="22"/>
-              </w:rPr>
-            </w:r>
-          </w:p>
-          <w:p>
-            <w:pPr>
-              <w:jc w:val="left"/>
-            </w:pPr>
-            <w:r/>
-            <w:r>
-              <w:rPr>
-                <w:rFonts w:ascii="宋体" w:hAnsi="宋体" w:eastAsia="宋体"/>
-                <w:b w:val="0"/>
-                <w:sz w:val="22"/>
-              </w:rPr>
-            </w:r>
-          </w:p>
-          <w:p>
-            <w:pPr>
-              <w:jc w:val="left"/>
-            </w:pPr>
-            <w:r/>
-            <w:r>
-              <w:rPr>
-                <w:rFonts w:ascii="宋体" w:hAnsi="宋体" w:eastAsia="宋体"/>
-                <w:b w:val="0"/>
-                <w:sz w:val="22"/>
-              </w:rPr>
-            </w:r>
-          </w:p>
-          <w:p>
-            <w:pPr>
-              <w:jc w:val="left"/>
-            </w:pPr>
-            <w:r/>
-            <w:r>
-              <w:rPr>
-                <w:rFonts w:ascii="宋体" w:hAnsi="宋体" w:eastAsia="宋体"/>
-                <w:b w:val="0"/>
-                <w:sz w:val="22"/>
-              </w:rPr>
-            </w:r>
-          </w:p>
-          <w:p>
-            <w:pPr>
-              <w:jc w:val="left"/>
-            </w:pPr>
-            <w:r/>
-            <w:r>
-              <w:rPr>
-                <w:rFonts w:ascii="宋体" w:hAnsi="宋体" w:eastAsia="宋体"/>
-                <w:b w:val="0"/>
-                <w:sz w:val="22"/>
-              </w:rPr>
-            </w:r>
-          </w:p>
-        </w:tc>
-      </w:tr>
-      <w:tr>
-        <w:trPr>
-          <w:trHeight w:val="1360" w:hRule="atLeast"/>
-        </w:trPr>
-        <w:tc>
-          <w:tcPr>
-            <w:tcW w:type="dxa" w:w="8447"/>
-            <w:gridSpan w:val="6"/>
-            <w:vAlign w:val="center"/>
-          </w:tcPr>
-          <w:p>
-            <w:pPr>
-              <w:jc w:val="center"/>
-            </w:pPr>
-            <w:r/>
-            <w:r>
-              <w:rPr>
-                <w:rFonts w:ascii="宋体" w:hAnsi="宋体" w:eastAsia="宋体"/>
-                <w:b w:val="0"/>
-                <w:sz w:val="22"/>
-              </w:rPr>
-            </w:r>
-          </w:p>
-          <w:p>
-            <w:pPr>
-              <w:jc w:val="left"/>
-            </w:pPr>
-            <w:r/>
-            <w:r>
-              <w:rPr>
-                <w:rFonts w:ascii="宋体" w:hAnsi="宋体" w:eastAsia="宋体"/>
-                <w:b w:val="0"/>
-                <w:sz w:val="22"/>
-              </w:rPr>
-            </w:r>
-          </w:p>
-          <w:p>
-            <w:pPr>
-              <w:jc w:val="left"/>
-            </w:pPr>
-            <w:r/>
-            <w:r>
-              <w:rPr>
-                <w:rFonts w:ascii="宋体" w:hAnsi="宋体" w:eastAsia="宋体"/>
-                <w:b w:val="0"/>
-                <w:sz w:val="22"/>
-              </w:rPr>
-            </w:r>
-          </w:p>
-          <w:p>
-            <w:pPr>
-              <w:jc w:val="left"/>
-            </w:pPr>
-            <w:r/>
-            <w:r>
-              <w:rPr>
-                <w:rFonts w:ascii="宋体" w:hAnsi="宋体" w:eastAsia="宋体"/>
-                <w:b w:val="0"/>
-                <w:sz w:val="22"/>
-              </w:rPr>
-            </w:r>
-          </w:p>
-          <w:p>
-            <w:pPr>
-              <w:jc w:val="left"/>
-            </w:pPr>
-            <w:r/>
-            <w:r>
-              <w:rPr>
-                <w:rFonts w:ascii="宋体" w:hAnsi="宋体" w:eastAsia="宋体"/>
-                <w:b w:val="0"/>
-                <w:sz w:val="22"/>
-              </w:rPr>
-            </w:r>
-          </w:p>
-          <w:p>
-            <w:pPr>
-              <w:jc w:val="left"/>
-            </w:pPr>
-            <w:r/>
-            <w:r>
-              <w:rPr>
-                <w:rFonts w:ascii="宋体" w:hAnsi="宋体" w:eastAsia="宋体"/>
-                <w:b w:val="0"/>
-                <w:sz w:val="22"/>
-              </w:rPr>
-            </w:r>
-          </w:p>
-        </w:tc>
-      </w:tr>
-      <w:tr>
-        <w:tc>
-          <w:tcPr>
-            <w:tcW w:type="dxa" w:w="8447"/>
-            <w:gridSpan w:val="6"/>
-            <w:vAlign w:val="center"/>
-            <w:shd w:fill="F2F2F2"/>
-          </w:tcPr>
-          <w:p>
-            <w:pPr>
-              <w:jc w:val="left"/>
-            </w:pPr>
-            <w:r/>
-            <w:r>
-              <w:rPr>
-                <w:rFonts w:ascii="宋体" w:hAnsi="宋体" w:eastAsia="宋体"/>
-                <w:b w:val="0"/>
-                <w:sz w:val="22"/>
-              </w:rPr>
-              <w:t>二、主要内容与基本要求</w:t>
-            </w:r>
-          </w:p>
-          <w:p>
-            <w:pPr>
-              <w:jc w:val="left"/>
-            </w:pPr>
-            <w:r/>
-            <w:r>
-              <w:rPr>
-                <w:rFonts w:ascii="宋体" w:hAnsi="宋体" w:eastAsia="宋体"/>
-                <w:b w:val="0"/>
-                <w:sz w:val="22"/>
-              </w:rPr>
-            </w:r>
-          </w:p>
-          <w:p>
-            <w:pPr>
-              <w:jc w:val="left"/>
-            </w:pPr>
-            <w:r/>
-            <w:r>
-              <w:rPr>
-                <w:rFonts w:ascii="宋体" w:hAnsi="宋体" w:eastAsia="宋体"/>
-                <w:b w:val="0"/>
-                <w:sz w:val="22"/>
-              </w:rPr>
-            </w:r>
-          </w:p>
-          <w:p>
-            <w:pPr>
-              <w:jc w:val="left"/>
-            </w:pPr>
-            <w:r/>
-            <w:r>
-              <w:rPr>
-                <w:rFonts w:ascii="宋体" w:hAnsi="宋体" w:eastAsia="宋体"/>
-                <w:b w:val="0"/>
-                <w:sz w:val="22"/>
-              </w:rPr>
-            </w:r>
-          </w:p>
-          <w:p>
-            <w:pPr>
-              <w:jc w:val="left"/>
-            </w:pPr>
-            <w:r/>
-            <w:r>
-              <w:rPr>
-                <w:rFonts w:ascii="宋体" w:hAnsi="宋体" w:eastAsia="宋体"/>
-                <w:b w:val="0"/>
-                <w:sz w:val="22"/>
-              </w:rPr>
-            </w:r>
-          </w:p>
-          <w:p>
-            <w:pPr>
-              <w:jc w:val="left"/>
-            </w:pPr>
-            <w:r/>
-            <w:r>
-              <w:rPr>
-                <w:rFonts w:ascii="宋体" w:hAnsi="宋体" w:eastAsia="宋体"/>
-                <w:b w:val="0"/>
-                <w:sz w:val="22"/>
-              </w:rPr>
-            </w:r>
-          </w:p>
-        </w:tc>
-      </w:tr>
-      <w:tr>
-        <w:trPr>
-          <w:trHeight w:val="1360" w:hRule="atLeast"/>
-        </w:trPr>
-        <w:tc>
-          <w:tcPr>
-            <w:tcW w:type="dxa" w:w="8447"/>
-            <w:gridSpan w:val="6"/>
-            <w:vAlign w:val="center"/>
-          </w:tcPr>
-          <w:p>
-            <w:pPr>
-              <w:jc w:val="center"/>
-            </w:pPr>
-            <w:r/>
-            <w:r>
-              <w:rPr>
-                <w:rFonts w:ascii="宋体" w:hAnsi="宋体" w:eastAsia="宋体"/>
-                <w:b w:val="0"/>
-                <w:sz w:val="22"/>
-              </w:rPr>
-            </w:r>
-          </w:p>
-          <w:p>
-            <w:pPr>
-              <w:jc w:val="left"/>
-            </w:pPr>
-            <w:r/>
-            <w:r>
-              <w:rPr>
-                <w:rFonts w:ascii="宋体" w:hAnsi="宋体" w:eastAsia="宋体"/>
-                <w:b w:val="0"/>
-                <w:sz w:val="22"/>
-              </w:rPr>
-            </w:r>
-          </w:p>
-          <w:p>
-            <w:pPr>
-              <w:jc w:val="left"/>
-            </w:pPr>
-            <w:r/>
-            <w:r>
-              <w:rPr>
-                <w:rFonts w:ascii="宋体" w:hAnsi="宋体" w:eastAsia="宋体"/>
-                <w:b w:val="0"/>
-                <w:sz w:val="22"/>
-              </w:rPr>
-            </w:r>
-          </w:p>
-          <w:p>
-            <w:pPr>
-              <w:jc w:val="left"/>
-            </w:pPr>
-            <w:r/>
-            <w:r>
-              <w:rPr>
-                <w:rFonts w:ascii="宋体" w:hAnsi="宋体" w:eastAsia="宋体"/>
-                <w:b w:val="0"/>
-                <w:sz w:val="22"/>
-              </w:rPr>
-            </w:r>
-          </w:p>
-          <w:p>
-            <w:pPr>
-              <w:jc w:val="left"/>
-            </w:pPr>
-            <w:r/>
-            <w:r>
-              <w:rPr>
-                <w:rFonts w:ascii="宋体" w:hAnsi="宋体" w:eastAsia="宋体"/>
-                <w:b w:val="0"/>
-                <w:sz w:val="22"/>
-              </w:rPr>
-            </w:r>
-          </w:p>
-          <w:p>
-            <w:pPr>
-              <w:jc w:val="left"/>
-            </w:pPr>
-            <w:r/>
-            <w:r>
-              <w:rPr>
-                <w:rFonts w:ascii="宋体" w:hAnsi="宋体" w:eastAsia="宋体"/>
-                <w:b w:val="0"/>
-                <w:sz w:val="22"/>
-              </w:rPr>
-            </w:r>
-          </w:p>
-        </w:tc>
-      </w:tr>
-      <w:tr>
-        <w:tc>
-          <w:tcPr>
-            <w:tcW w:type="dxa" w:w="8447"/>
-            <w:gridSpan w:val="6"/>
-            <w:vAlign w:val="center"/>
-            <w:shd w:fill="F2F2F2"/>
-          </w:tcPr>
-          <w:p>
-            <w:pPr>
-              <w:jc w:val="left"/>
-            </w:pPr>
-            <w:r/>
-            <w:r>
-              <w:rPr>
-                <w:rFonts w:ascii="宋体" w:hAnsi="宋体" w:eastAsia="宋体"/>
-                <w:b w:val="0"/>
-                <w:sz w:val="22"/>
-              </w:rPr>
-              <w:t>三、进度安排</w:t>
-            </w:r>
-          </w:p>
-          <w:p>
-            <w:pPr>
-              <w:jc w:val="left"/>
-            </w:pPr>
-            <w:r/>
-            <w:r>
-              <w:rPr>
-                <w:rFonts w:ascii="宋体" w:hAnsi="宋体" w:eastAsia="宋体"/>
-                <w:b w:val="0"/>
-                <w:sz w:val="22"/>
-              </w:rPr>
-            </w:r>
-          </w:p>
-          <w:p>
-            <w:pPr>
-              <w:jc w:val="left"/>
-            </w:pPr>
-            <w:r/>
-            <w:r>
-              <w:rPr>
-                <w:rFonts w:ascii="宋体" w:hAnsi="宋体" w:eastAsia="宋体"/>
-                <w:b w:val="0"/>
-                <w:sz w:val="22"/>
-              </w:rPr>
-            </w:r>
-          </w:p>
-          <w:p>
-            <w:pPr>
-              <w:jc w:val="left"/>
-            </w:pPr>
-            <w:r/>
-            <w:r>
-              <w:rPr>
-                <w:rFonts w:ascii="宋体" w:hAnsi="宋体" w:eastAsia="宋体"/>
-                <w:b w:val="0"/>
-                <w:sz w:val="22"/>
-              </w:rPr>
-            </w:r>
-          </w:p>
-          <w:p>
-            <w:pPr>
-              <w:jc w:val="left"/>
-            </w:pPr>
-            <w:r/>
-            <w:r>
-              <w:rPr>
-                <w:rFonts w:ascii="宋体" w:hAnsi="宋体" w:eastAsia="宋体"/>
-                <w:b w:val="0"/>
-                <w:sz w:val="22"/>
-              </w:rPr>
-            </w:r>
-          </w:p>
-          <w:p>
-            <w:pPr>
-              <w:jc w:val="left"/>
-            </w:pPr>
-            <w:r/>
-            <w:r>
-              <w:rPr>
-                <w:rFonts w:ascii="宋体" w:hAnsi="宋体" w:eastAsia="宋体"/>
-                <w:b w:val="0"/>
-                <w:sz w:val="22"/>
-              </w:rPr>
-            </w:r>
-          </w:p>
-        </w:tc>
-      </w:tr>
-      <w:tr>
-        <w:trPr>
-          <w:trHeight w:val="1360" w:hRule="atLeast"/>
-        </w:trPr>
-        <w:tc>
-          <w:tcPr>
-            <w:tcW w:type="dxa" w:w="8447"/>
-            <w:gridSpan w:val="6"/>
-            <w:vAlign w:val="center"/>
-          </w:tcPr>
-          <w:p>
-            <w:pPr>
-              <w:jc w:val="center"/>
-            </w:pPr>
-            <w:r/>
-            <w:r>
-              <w:rPr>
-                <w:rFonts w:ascii="宋体" w:hAnsi="宋体" w:eastAsia="宋体"/>
-                <w:b w:val="0"/>
-                <w:sz w:val="22"/>
-              </w:rPr>
-            </w:r>
-          </w:p>
-          <w:p>
-            <w:pPr>
-              <w:jc w:val="left"/>
-            </w:pPr>
-            <w:r/>
-            <w:r>
-              <w:rPr>
-                <w:rFonts w:ascii="宋体" w:hAnsi="宋体" w:eastAsia="宋体"/>
-                <w:b w:val="0"/>
-                <w:sz w:val="22"/>
-              </w:rPr>
-            </w:r>
-          </w:p>
-          <w:p>
-            <w:pPr>
-              <w:jc w:val="left"/>
-            </w:pPr>
-            <w:r/>
-            <w:r>
-              <w:rPr>
-                <w:rFonts w:ascii="宋体" w:hAnsi="宋体" w:eastAsia="宋体"/>
-                <w:b w:val="0"/>
-                <w:sz w:val="22"/>
-              </w:rPr>
-            </w:r>
-          </w:p>
-          <w:p>
-            <w:pPr>
-              <w:jc w:val="left"/>
-            </w:pPr>
-            <w:r/>
-            <w:r>
-              <w:rPr>
-                <w:rFonts w:ascii="宋体" w:hAnsi="宋体" w:eastAsia="宋体"/>
-                <w:b w:val="0"/>
-                <w:sz w:val="22"/>
-              </w:rPr>
-            </w:r>
-          </w:p>
-          <w:p>
-            <w:pPr>
-              <w:jc w:val="left"/>
-            </w:pPr>
-            <w:r/>
-            <w:r>
-              <w:rPr>
-                <w:rFonts w:ascii="宋体" w:hAnsi="宋体" w:eastAsia="宋体"/>
-                <w:b w:val="0"/>
-                <w:sz w:val="22"/>
-              </w:rPr>
-            </w:r>
-          </w:p>
-          <w:p>
-            <w:pPr>
-              <w:jc w:val="left"/>
-            </w:pPr>
-            <w:r/>
-            <w:r>
-              <w:rPr>
-                <w:rFonts w:ascii="宋体" w:hAnsi="宋体" w:eastAsia="宋体"/>
-                <w:b w:val="0"/>
-                <w:sz w:val="22"/>
-              </w:rPr>
-            </w:r>
-          </w:p>
-        </w:tc>
-      </w:tr>
-      <w:tr>
-        <w:tc>
-          <w:tcPr>
-            <w:tcW w:type="dxa" w:w="8447"/>
-            <w:gridSpan w:val="6"/>
-            <w:vAlign w:val="center"/>
-            <w:shd w:fill="F2F2F2"/>
-          </w:tcPr>
-          <w:p>
-            <w:pPr>
-              <w:jc w:val="left"/>
-            </w:pPr>
-            <w:r/>
-            <w:r>
-              <w:rPr>
-                <w:rFonts w:ascii="宋体" w:hAnsi="宋体" w:eastAsia="宋体"/>
-                <w:b w:val="0"/>
-                <w:sz w:val="22"/>
-              </w:rPr>
-              <w:t>四、主要参考资料</w:t>
-            </w:r>
-          </w:p>
-          <w:p>
-            <w:pPr>
-              <w:jc w:val="left"/>
-            </w:pPr>
-            <w:r/>
-            <w:r>
-              <w:rPr>
-                <w:rFonts w:ascii="宋体" w:hAnsi="宋体" w:eastAsia="宋体"/>
-                <w:b w:val="0"/>
-                <w:sz w:val="22"/>
-              </w:rPr>
-            </w:r>
-          </w:p>
-          <w:p>
-            <w:pPr>
-              <w:jc w:val="left"/>
-            </w:pPr>
-            <w:r/>
-            <w:r>
-              <w:rPr>
-                <w:rFonts w:ascii="宋体" w:hAnsi="宋体" w:eastAsia="宋体"/>
-                <w:b w:val="0"/>
-                <w:sz w:val="22"/>
-              </w:rPr>
-            </w:r>
-          </w:p>
-          <w:p>
-            <w:pPr>
-              <w:jc w:val="left"/>
-            </w:pPr>
-            <w:r/>
-            <w:r>
-              <w:rPr>
-                <w:rFonts w:ascii="宋体" w:hAnsi="宋体" w:eastAsia="宋体"/>
-                <w:b w:val="0"/>
-                <w:sz w:val="22"/>
-              </w:rPr>
-            </w:r>
-          </w:p>
-          <w:p>
-            <w:pPr>
-              <w:jc w:val="left"/>
-            </w:pPr>
-            <w:r/>
-            <w:r>
-              <w:rPr>
-                <w:rFonts w:ascii="宋体" w:hAnsi="宋体" w:eastAsia="宋体"/>
-                <w:b w:val="0"/>
-                <w:sz w:val="22"/>
-              </w:rPr>
-            </w:r>
-          </w:p>
-          <w:p>
-            <w:pPr>
-              <w:jc w:val="left"/>
-            </w:pPr>
-            <w:r/>
-            <w:r>
-              <w:rPr>
-                <w:rFonts w:ascii="宋体" w:hAnsi="宋体" w:eastAsia="宋体"/>
-                <w:b w:val="0"/>
-                <w:sz w:val="22"/>
-              </w:rPr>
-            </w:r>
-          </w:p>
-        </w:tc>
-      </w:tr>
-      <w:tr>
-        <w:trPr>
-          <w:trHeight w:val="1360" w:hRule="atLeast"/>
-        </w:trPr>
-        <w:tc>
-          <w:tcPr>
-            <w:tcW w:type="dxa" w:w="8447"/>
-            <w:gridSpan w:val="6"/>
-            <w:vAlign w:val="center"/>
-          </w:tcPr>
-          <w:p>
-            <w:pPr>
-              <w:jc w:val="center"/>
-            </w:pPr>
-            <w:r/>
-            <w:r>
-              <w:rPr>
-                <w:rFonts w:ascii="宋体" w:hAnsi="宋体" w:eastAsia="宋体"/>
-                <w:b w:val="0"/>
-                <w:sz w:val="22"/>
-              </w:rPr>
-            </w:r>
-          </w:p>
-          <w:p>
-            <w:pPr>
-              <w:jc w:val="left"/>
-            </w:pPr>
-            <w:r/>
-            <w:r>
-              <w:rPr>
-                <w:rFonts w:ascii="宋体" w:hAnsi="宋体" w:eastAsia="宋体"/>
-                <w:b w:val="0"/>
-                <w:sz w:val="22"/>
-              </w:rPr>
-            </w:r>
-          </w:p>
-          <w:p>
-            <w:pPr>
-              <w:jc w:val="left"/>
-            </w:pPr>
-            <w:r/>
-            <w:r>
-              <w:rPr>
-                <w:rFonts w:ascii="宋体" w:hAnsi="宋体" w:eastAsia="宋体"/>
-                <w:b w:val="0"/>
-                <w:sz w:val="22"/>
-              </w:rPr>
-            </w:r>
-          </w:p>
-          <w:p>
-            <w:pPr>
-              <w:jc w:val="left"/>
-            </w:pPr>
-            <w:r/>
-            <w:r>
-              <w:rPr>
-                <w:rFonts w:ascii="宋体" w:hAnsi="宋体" w:eastAsia="宋体"/>
-                <w:b w:val="0"/>
-                <w:sz w:val="22"/>
-              </w:rPr>
-            </w:r>
-          </w:p>
-          <w:p>
-            <w:pPr>
-              <w:jc w:val="left"/>
-            </w:pPr>
-            <w:r/>
-            <w:r>
-              <w:rPr>
-                <w:rFonts w:ascii="宋体" w:hAnsi="宋体" w:eastAsia="宋体"/>
-                <w:b w:val="0"/>
-                <w:sz w:val="22"/>
-              </w:rPr>
-            </w:r>
-          </w:p>
-          <w:p>
-            <w:pPr>
-              <w:jc w:val="left"/>
-            </w:pPr>
-            <w:r/>
-            <w:r>
-              <w:rPr>
-                <w:rFonts w:ascii="宋体" w:hAnsi="宋体" w:eastAsia="宋体"/>
-                <w:b w:val="0"/>
-                <w:sz w:val="22"/>
-              </w:rPr>
-            </w:r>
-          </w:p>
-        </w:tc>
-      </w:tr>
-      <w:tr>
-        <w:trPr>
-          <w:trHeight w:val="1134" w:hRule="atLeast"/>
-        </w:trPr>
-        <w:tc>
-          <w:tcPr>
-            <w:tcW w:type="dxa" w:w="8447"/>
-            <w:gridSpan w:val="6"/>
-            <w:vAlign w:val="center"/>
-            <w:shd w:fill="F2F2F2"/>
-          </w:tcPr>
-          <w:p>
-            <w:pPr>
-              <w:jc w:val="left"/>
-            </w:pPr>
-            <w:r/>
-            <w:r>
-              <w:rPr>
-                <w:rFonts w:ascii="宋体" w:hAnsi="宋体" w:eastAsia="宋体"/>
-                <w:b w:val="0"/>
-                <w:sz w:val="22"/>
-              </w:rPr>
-              <w:t>指导教师意见</w:t>
-            </w:r>
-          </w:p>
-          <w:p>
-            <w:pPr>
-              <w:jc w:val="left"/>
-            </w:pPr>
-            <w:r/>
-            <w:r>
-              <w:rPr>
-                <w:rFonts w:ascii="宋体" w:hAnsi="宋体" w:eastAsia="宋体"/>
-                <w:b w:val="0"/>
-                <w:sz w:val="22"/>
-              </w:rPr>
-            </w:r>
-          </w:p>
-          <w:p>
-            <w:pPr>
-              <w:jc w:val="left"/>
-            </w:pPr>
-            <w:r/>
-            <w:r>
-              <w:rPr>
-                <w:rFonts w:ascii="宋体" w:hAnsi="宋体" w:eastAsia="宋体"/>
-                <w:b w:val="0"/>
-                <w:sz w:val="22"/>
-              </w:rPr>
-            </w:r>
-          </w:p>
-          <w:p>
-            <w:pPr>
-              <w:jc w:val="left"/>
-            </w:pPr>
-            <w:r/>
-            <w:r>
-              <w:rPr>
-                <w:rFonts w:ascii="宋体" w:hAnsi="宋体" w:eastAsia="宋体"/>
-                <w:b w:val="0"/>
-                <w:sz w:val="22"/>
-              </w:rPr>
-            </w:r>
-          </w:p>
-          <w:p>
-            <w:pPr>
-              <w:jc w:val="left"/>
-            </w:pPr>
-            <w:r/>
-            <w:r>
-              <w:rPr>
-                <w:rFonts w:ascii="宋体" w:hAnsi="宋体" w:eastAsia="宋体"/>
-                <w:b w:val="0"/>
-                <w:sz w:val="22"/>
-              </w:rPr>
-            </w:r>
-          </w:p>
-          <w:p>
-            <w:pPr>
-              <w:jc w:val="left"/>
-            </w:pPr>
-            <w:r/>
-            <w:r>
-              <w:rPr>
-                <w:rFonts w:ascii="宋体" w:hAnsi="宋体" w:eastAsia="宋体"/>
-                <w:b w:val="0"/>
-                <w:sz w:val="22"/>
-              </w:rPr>
-            </w:r>
-          </w:p>
-        </w:tc>
-      </w:tr>
-      <w:tr>
-        <w:trPr>
-          <w:trHeight w:val="1134" w:hRule="atLeast"/>
-        </w:trPr>
-        <w:tc>
-          <w:tcPr>
-            <w:tcW w:type="dxa" w:w="8447"/>
-            <w:gridSpan w:val="6"/>
-            <w:vAlign w:val="center"/>
-            <w:shd w:fill="F2F2F2"/>
-          </w:tcPr>
-          <w:p>
-            <w:pPr>
-              <w:jc w:val="left"/>
-            </w:pPr>
-            <w:r/>
-            <w:r>
-              <w:rPr>
-                <w:rFonts w:ascii="宋体" w:hAnsi="宋体" w:eastAsia="宋体"/>
-                <w:b w:val="0"/>
-                <w:sz w:val="22"/>
-              </w:rPr>
-              <w:t>学院审核意见</w:t>
-            </w:r>
-          </w:p>
-          <w:p>
-            <w:pPr>
-              <w:jc w:val="left"/>
-            </w:pPr>
-            <w:r/>
-            <w:r>
-              <w:rPr>
-                <w:rFonts w:ascii="宋体" w:hAnsi="宋体" w:eastAsia="宋体"/>
-                <w:b w:val="0"/>
-                <w:sz w:val="22"/>
-              </w:rPr>
-            </w:r>
-          </w:p>
-          <w:p>
-            <w:pPr>
-              <w:jc w:val="left"/>
-            </w:pPr>
-            <w:r/>
-            <w:r>
-              <w:rPr>
-                <w:rFonts w:ascii="宋体" w:hAnsi="宋体" w:eastAsia="宋体"/>
-                <w:b w:val="0"/>
-                <w:sz w:val="22"/>
-              </w:rPr>
-            </w:r>
-          </w:p>
-          <w:p>
-            <w:pPr>
-              <w:jc w:val="left"/>
-            </w:pPr>
-            <w:r/>
-            <w:r>
-              <w:rPr>
-                <w:rFonts w:ascii="宋体" w:hAnsi="宋体" w:eastAsia="宋体"/>
-                <w:b w:val="0"/>
-                <w:sz w:val="22"/>
-              </w:rPr>
-            </w:r>
-          </w:p>
-          <w:p>
-            <w:pPr>
-              <w:jc w:val="left"/>
-            </w:pPr>
-            <w:r/>
-            <w:r>
-              <w:rPr>
-                <w:rFonts w:ascii="宋体" w:hAnsi="宋体" w:eastAsia="宋体"/>
-                <w:b w:val="0"/>
-                <w:sz w:val="22"/>
-              </w:rPr>
-            </w:r>
-          </w:p>
-          <w:p>
-            <w:pPr>
-              <w:jc w:val="left"/>
-            </w:pPr>
-            <w:r/>
-            <w:r>
-              <w:rPr>
-                <w:rFonts w:ascii="宋体" w:hAnsi="宋体" w:eastAsia="宋体"/>
-                <w:b w:val="0"/>
-                <w:sz w:val="22"/>
-              </w:rPr>
-            </w:r>
-          </w:p>
-        </w:tc>
-      </w:tr>
-    </w:tbl>
+    <w:p>
+      <w:r>
+        <w:br w:type="page"/>
+      </w:r>
+    </w:p>
     <w:p>
       <w:pPr>
-        <w:jc w:val="right"/>
+        <w:spacing w:before="0" w:after="0" w:line="240" w:lineRule="auto"/>
+        <w:jc w:val="center"/>
       </w:pPr>
       <w:r>
-        <w:rPr>
-          <w:rFonts w:ascii="宋体" w:hAnsi="宋体" w:eastAsia="宋体"/>
-          <w:sz w:val="22"/>
-        </w:rPr>
-        <w:t>指导教师签名：______________</w:t>
-      </w:r>
-      <w:r>
-        <w:t xml:space="preserve">    </w:t>
-      </w:r>
-      <w:r>
-        <w:rPr>
-          <w:rFonts w:ascii="宋体" w:hAnsi="宋体" w:eastAsia="宋体"/>
-          <w:sz w:val="22"/>
-        </w:rPr>
-        <w:t>日期：______________</w:t>
+        <w:drawing>
+          <wp:inline xmlns:a="http://schemas.openxmlformats.org/drawingml/2006/main" xmlns:pic="http://schemas.openxmlformats.org/drawingml/2006/picture">
+            <wp:extent cx="7560000" cy="10102301"/>
+            <wp:docPr id="2" name="Picture 2"/>
+            <wp:cNvGraphicFramePr>
+              <a:graphicFrameLocks noChangeAspect="1"/>
+            </wp:cNvGraphicFramePr>
+            <a:graphic>
+              <a:graphicData uri="http://schemas.openxmlformats.org/drawingml/2006/picture">
+                <pic:pic>
+                  <pic:nvPicPr>
+                    <pic:cNvPr id="0" name="page_17_xref_87.jpeg"/>
+                    <pic:cNvPicPr/>
+                  </pic:nvPicPr>
+                  <pic:blipFill>
+                    <a:blip r:embed="rId10"/>
+                    <a:stretch>
+                      <a:fillRect/>
+                    </a:stretch>
+                  </pic:blipFill>
+                  <pic:spPr>
+                    <a:xfrm>
+                      <a:off x="0" y="0"/>
+                      <a:ext cx="7560000" cy="10102301"/>
+                    </a:xfrm>
+                    <a:prstGeom prst="rect"/>
+                  </pic:spPr>
+                </pic:pic>
+              </a:graphicData>
+            </a:graphic>
+          </wp:inline>
+        </w:drawing>
       </w:r>
     </w:p>
     <w:sectPr>
       <w:pgSz w:w="11906" w:h="16838"/>
-      <w:pgMar w:top="1247" w:right="1304" w:bottom="1134" w:left="1417" w:header="720" w:footer="720" w:gutter="0"/>
+      <w:pgMar w:top="0" w:right="0" w:bottom="0" w:left="0" w:header="0" w:footer="0" w:gutter="0"/>
       <w:cols w:space="720"/>
       <w:docGrid w:linePitch="360"/>
     </w:sectPr>
@@ -1660,10 +460,6 @@
     <w:name w:val="Normal"/>
     <w:qFormat/>
     <w:rsid w:val="00FC693F"/>
-    <w:rPr>
-      <w:rFonts w:ascii="宋体" w:hAnsi="宋体" w:eastAsia="宋体"/>
-      <w:sz w:val="22"/>
-    </w:rPr>
   </w:style>
   <w:style w:type="paragraph" w:styleId="Header">
     <w:name w:val="header"/>

</xml_diff>

<commit_message>
Rebuild thesis templates with exact A4 page layout
Agent-Logs-Url: https://github.com/wkybill/process/sessions/5a117eac-fb67-4c74-9ea1-9d50c38f4937

Co-authored-by: wkybill <151885169+wkybill@users.noreply.github.com>
</commit_message>
<xml_diff>
--- a/本科毕业论文任务书.docx
+++ b/本科毕业论文任务书.docx
@@ -10,7 +10,7 @@
       <w:r>
         <w:drawing>
           <wp:inline xmlns:a="http://schemas.openxmlformats.org/drawingml/2006/main" xmlns:pic="http://schemas.openxmlformats.org/drawingml/2006/picture">
-            <wp:extent cx="7560000" cy="9668077"/>
+            <wp:extent cx="7560000" cy="10692000"/>
             <wp:docPr id="1" name="Picture 1"/>
             <wp:cNvGraphicFramePr>
               <a:graphicFrameLocks noChangeAspect="1"/>
@@ -19,7 +19,7 @@
               <a:graphicData uri="http://schemas.openxmlformats.org/drawingml/2006/picture">
                 <pic:pic>
                   <pic:nvPicPr>
-                    <pic:cNvPr id="0" name="page_17_xref_88.jpeg"/>
+                    <pic:cNvPr id="0" name="本科毕业论文任务书.docx-1.png"/>
                     <pic:cNvPicPr/>
                   </pic:nvPicPr>
                   <pic:blipFill>
@@ -31,7 +31,7 @@
                   <pic:spPr>
                     <a:xfrm>
                       <a:off x="0" y="0"/>
-                      <a:ext cx="7560000" cy="9668077"/>
+                      <a:ext cx="7560000" cy="10692000"/>
                     </a:xfrm>
                     <a:prstGeom prst="rect"/>
                   </pic:spPr>
@@ -43,9 +43,14 @@
       </w:r>
     </w:p>
     <w:p>
-      <w:r>
-        <w:br w:type="page"/>
-      </w:r>
+      <w:pPr>
+        <w:sectPr>
+          <w:pgSz w:w="11906" w:h="16838"/>
+          <w:pgMar w:top="0" w:right="0" w:bottom="0" w:left="0" w:header="0" w:footer="0" w:gutter="0"/>
+          <w:cols w:space="720"/>
+          <w:docGrid w:linePitch="360"/>
+        </w:sectPr>
+      </w:pPr>
     </w:p>
     <w:p>
       <w:pPr>
@@ -55,7 +60,7 @@
       <w:r>
         <w:drawing>
           <wp:inline xmlns:a="http://schemas.openxmlformats.org/drawingml/2006/main" xmlns:pic="http://schemas.openxmlformats.org/drawingml/2006/picture">
-            <wp:extent cx="7560000" cy="10102301"/>
+            <wp:extent cx="7560000" cy="10692000"/>
             <wp:docPr id="2" name="Picture 2"/>
             <wp:cNvGraphicFramePr>
               <a:graphicFrameLocks noChangeAspect="1"/>
@@ -64,7 +69,7 @@
               <a:graphicData uri="http://schemas.openxmlformats.org/drawingml/2006/picture">
                 <pic:pic>
                   <pic:nvPicPr>
-                    <pic:cNvPr id="0" name="page_17_xref_87.jpeg"/>
+                    <pic:cNvPr id="0" name="本科毕业论文任务书.docx-2.png"/>
                     <pic:cNvPicPr/>
                   </pic:nvPicPr>
                   <pic:blipFill>
@@ -76,7 +81,7 @@
                   <pic:spPr>
                     <a:xfrm>
                       <a:off x="0" y="0"/>
-                      <a:ext cx="7560000" cy="10102301"/>
+                      <a:ext cx="7560000" cy="10692000"/>
                     </a:xfrm>
                     <a:prstGeom prst="rect"/>
                   </pic:spPr>

</xml_diff>

<commit_message>
Replace screenshot docs with editable thesis templates
Agent-Logs-Url: https://github.com/wkybill/process/sessions/0e4a4fd0-fb61-4a82-85b4-dab19bba82e3

Co-authored-by: wkybill <151885169+wkybill@users.noreply.github.com>
</commit_message>
<xml_diff>
--- a/本科毕业论文任务书.docx
+++ b/本科毕业论文任务书.docx
@@ -4,97 +4,1612 @@
   <w:body>
     <w:p>
       <w:pPr>
-        <w:spacing w:before="0" w:after="0" w:line="240" w:lineRule="auto"/>
+        <w:spacing w:before="0" w:after="200"/>
         <w:jc w:val="center"/>
       </w:pPr>
       <w:r>
-        <w:drawing>
-          <wp:inline xmlns:a="http://schemas.openxmlformats.org/drawingml/2006/main" xmlns:pic="http://schemas.openxmlformats.org/drawingml/2006/picture">
-            <wp:extent cx="7560000" cy="10692000"/>
-            <wp:docPr id="1" name="Picture 1"/>
-            <wp:cNvGraphicFramePr>
-              <a:graphicFrameLocks noChangeAspect="1"/>
-            </wp:cNvGraphicFramePr>
-            <a:graphic>
-              <a:graphicData uri="http://schemas.openxmlformats.org/drawingml/2006/picture">
-                <pic:pic>
-                  <pic:nvPicPr>
-                    <pic:cNvPr id="0" name="本科毕业论文任务书.docx-1.png"/>
-                    <pic:cNvPicPr/>
-                  </pic:nvPicPr>
-                  <pic:blipFill>
-                    <a:blip r:embed="rId9"/>
-                    <a:stretch>
-                      <a:fillRect/>
-                    </a:stretch>
-                  </pic:blipFill>
-                  <pic:spPr>
-                    <a:xfrm>
-                      <a:off x="0" y="0"/>
-                      <a:ext cx="7560000" cy="10692000"/>
-                    </a:xfrm>
-                    <a:prstGeom prst="rect"/>
-                  </pic:spPr>
-                </pic:pic>
-              </a:graphicData>
-            </a:graphic>
-          </wp:inline>
-        </w:drawing>
+        <w:rPr>
+          <w:rFonts w:ascii="黑体" w:hAnsi="黑体" w:eastAsia="黑体"/>
+          <w:b/>
+          <w:sz w:val="44"/>
+        </w:rPr>
+        <w:t>任务书</w:t>
+      </w:r>
+    </w:p>
+    <w:tbl>
+      <w:tblPr>
+        <w:tblW w:type="auto" w:w="0"/>
+        <w:jc w:val="center"/>
+        <w:tblLayout w:type="fixed"/>
+        <w:tblLook w:firstColumn="1" w:firstRow="1" w:lastColumn="0" w:lastRow="0" w:noHBand="0" w:noVBand="1" w:val="04A0"/>
+        <w:tblBorders>
+          <w:top w:val="single" w:sz="12" w:space="0" w:color="000000"/>
+          <w:left w:val="single" w:sz="12" w:space="0" w:color="000000"/>
+          <w:bottom w:val="single" w:sz="12" w:space="0" w:color="000000"/>
+          <w:right w:val="single" w:sz="12" w:space="0" w:color="000000"/>
+          <w:insideH w:val="single" w:sz="12" w:space="0" w:color="000000"/>
+          <w:insideV w:val="single" w:sz="12" w:space="0" w:color="000000"/>
+        </w:tblBorders>
+      </w:tblPr>
+      <w:tblGrid>
+        <w:gridCol w:w="1644"/>
+        <w:gridCol w:w="1644"/>
+        <w:gridCol w:w="1644"/>
+        <w:gridCol w:w="1644"/>
+        <w:gridCol w:w="1644"/>
+        <w:gridCol w:w="1644"/>
+      </w:tblGrid>
+      <w:tr>
+        <w:trPr>
+          <w:trHeight w:val="567" w:hRule="atLeast"/>
+        </w:trPr>
+        <w:tc>
+          <w:tcPr>
+            <w:tcW w:type="dxa" w:w="1020"/>
+            <w:vAlign w:val="center"/>
+          </w:tcPr>
+          <w:p>
+            <w:pPr>
+              <w:spacing w:before="0" w:after="0" w:line="300" w:lineRule="auto"/>
+              <w:jc w:val="center"/>
+            </w:pPr>
+            <w:r/>
+            <w:r>
+              <w:rPr>
+                <w:rFonts w:ascii="宋体" w:hAnsi="宋体" w:eastAsia="宋体"/>
+                <w:b/>
+                <w:sz w:val="24"/>
+              </w:rPr>
+              <w:t>题目</w:t>
+            </w:r>
+          </w:p>
+        </w:tc>
+        <w:tc>
+          <w:tcPr>
+            <w:tcW w:type="dxa" w:w="8899"/>
+            <w:gridSpan w:val="5"/>
+            <w:vAlign w:val="top"/>
+          </w:tcPr>
+          <w:p>
+            <w:pPr>
+              <w:spacing w:before="0" w:after="0" w:line="300" w:lineRule="auto"/>
+              <w:jc w:val="left"/>
+            </w:pPr>
+            <w:r/>
+            <w:r>
+              <w:rPr>
+                <w:rFonts w:ascii="宋体" w:hAnsi="宋体" w:eastAsia="宋体"/>
+                <w:b w:val="0"/>
+                <w:sz w:val="20"/>
+              </w:rPr>
+              <w:t>请填写论文题目</w:t>
+            </w:r>
+          </w:p>
+        </w:tc>
+      </w:tr>
+      <w:tr>
+        <w:trPr>
+          <w:trHeight w:val="510" w:hRule="atLeast"/>
+        </w:trPr>
+        <w:tc>
+          <w:tcPr>
+            <w:tcW w:type="dxa" w:w="1020"/>
+            <w:vAlign w:val="center"/>
+          </w:tcPr>
+          <w:p>
+            <w:pPr>
+              <w:spacing w:before="0" w:after="0" w:line="300" w:lineRule="auto"/>
+              <w:jc w:val="center"/>
+            </w:pPr>
+            <w:r/>
+            <w:r>
+              <w:rPr>
+                <w:rFonts w:ascii="宋体" w:hAnsi="宋体" w:eastAsia="宋体"/>
+                <w:b/>
+                <w:sz w:val="24"/>
+              </w:rPr>
+              <w:t>姓名</w:t>
+            </w:r>
+          </w:p>
+        </w:tc>
+        <w:tc>
+          <w:tcPr>
+            <w:tcW w:type="dxa" w:w="4421"/>
+            <w:gridSpan w:val="2"/>
+            <w:vAlign w:val="top"/>
+          </w:tcPr>
+          <w:p>
+            <w:pPr>
+              <w:spacing w:before="0" w:after="0" w:line="300" w:lineRule="auto"/>
+              <w:jc w:val="left"/>
+            </w:pPr>
+            <w:r/>
+            <w:r>
+              <w:rPr>
+                <w:rFonts w:ascii="宋体" w:hAnsi="宋体" w:eastAsia="宋体"/>
+                <w:b w:val="0"/>
+                <w:sz w:val="20"/>
+              </w:rPr>
+              <w:t>请填写姓名</w:t>
+            </w:r>
+          </w:p>
+        </w:tc>
+        <w:tc>
+          <w:tcPr>
+            <w:tcW w:type="dxa" w:w="1417"/>
+            <w:vAlign w:val="center"/>
+          </w:tcPr>
+          <w:p>
+            <w:pPr>
+              <w:spacing w:before="0" w:after="0" w:line="300" w:lineRule="auto"/>
+              <w:jc w:val="center"/>
+            </w:pPr>
+            <w:r/>
+            <w:r>
+              <w:rPr>
+                <w:rFonts w:ascii="宋体" w:hAnsi="宋体" w:eastAsia="宋体"/>
+                <w:b/>
+                <w:sz w:val="24"/>
+              </w:rPr>
+              <w:t>学号</w:t>
+            </w:r>
+          </w:p>
+        </w:tc>
+        <w:tc>
+          <w:tcPr>
+            <w:tcW w:type="dxa" w:w="3061"/>
+            <w:gridSpan w:val="2"/>
+            <w:vAlign w:val="top"/>
+          </w:tcPr>
+          <w:p>
+            <w:pPr>
+              <w:spacing w:before="0" w:after="0" w:line="300" w:lineRule="auto"/>
+              <w:jc w:val="left"/>
+            </w:pPr>
+            <w:r/>
+            <w:r>
+              <w:rPr>
+                <w:rFonts w:ascii="宋体" w:hAnsi="宋体" w:eastAsia="宋体"/>
+                <w:b w:val="0"/>
+                <w:sz w:val="20"/>
+              </w:rPr>
+              <w:t>请填写学号</w:t>
+            </w:r>
+          </w:p>
+        </w:tc>
+      </w:tr>
+      <w:tr>
+        <w:trPr>
+          <w:trHeight w:val="680" w:hRule="atLeast"/>
+        </w:trPr>
+        <w:tc>
+          <w:tcPr>
+            <w:tcW w:type="dxa" w:w="1020"/>
+            <w:vAlign w:val="center"/>
+          </w:tcPr>
+          <w:p>
+            <w:pPr>
+              <w:spacing w:before="0" w:after="0" w:line="300" w:lineRule="auto"/>
+              <w:jc w:val="center"/>
+            </w:pPr>
+            <w:r/>
+            <w:r>
+              <w:rPr>
+                <w:rFonts w:ascii="宋体" w:hAnsi="宋体" w:eastAsia="宋体"/>
+                <w:b/>
+                <w:sz w:val="24"/>
+              </w:rPr>
+              <w:t>指导</w:t>
+            </w:r>
+            <w:r>
+              <w:br/>
+            </w:r>
+            <w:r>
+              <w:rPr>
+                <w:rFonts w:ascii="宋体" w:hAnsi="宋体" w:eastAsia="宋体"/>
+                <w:b/>
+                <w:sz w:val="24"/>
+              </w:rPr>
+              <w:t>教师</w:t>
+            </w:r>
+          </w:p>
+        </w:tc>
+        <w:tc>
+          <w:tcPr>
+            <w:tcW w:type="dxa" w:w="4421"/>
+            <w:gridSpan w:val="2"/>
+            <w:vAlign w:val="top"/>
+          </w:tcPr>
+          <w:p>
+            <w:pPr>
+              <w:spacing w:before="0" w:after="0" w:line="300" w:lineRule="auto"/>
+              <w:jc w:val="left"/>
+            </w:pPr>
+            <w:r/>
+            <w:r>
+              <w:rPr>
+                <w:rFonts w:ascii="宋体" w:hAnsi="宋体" w:eastAsia="宋体"/>
+                <w:b w:val="0"/>
+                <w:sz w:val="20"/>
+              </w:rPr>
+              <w:t>请填写指导教师</w:t>
+            </w:r>
+          </w:p>
+        </w:tc>
+        <w:tc>
+          <w:tcPr>
+            <w:tcW w:type="dxa" w:w="1417"/>
+            <w:vAlign w:val="center"/>
+          </w:tcPr>
+          <w:p>
+            <w:pPr>
+              <w:spacing w:before="0" w:after="0" w:line="300" w:lineRule="auto"/>
+              <w:jc w:val="center"/>
+            </w:pPr>
+            <w:r/>
+            <w:r>
+              <w:rPr>
+                <w:rFonts w:ascii="宋体" w:hAnsi="宋体" w:eastAsia="宋体"/>
+                <w:b/>
+                <w:sz w:val="24"/>
+              </w:rPr>
+              <w:t>职称</w:t>
+            </w:r>
+          </w:p>
+        </w:tc>
+        <w:tc>
+          <w:tcPr>
+            <w:tcW w:type="dxa" w:w="3061"/>
+            <w:gridSpan w:val="2"/>
+            <w:vAlign w:val="top"/>
+          </w:tcPr>
+          <w:p>
+            <w:pPr>
+              <w:spacing w:before="0" w:after="0" w:line="300" w:lineRule="auto"/>
+              <w:jc w:val="left"/>
+            </w:pPr>
+            <w:r/>
+            <w:r>
+              <w:rPr>
+                <w:rFonts w:ascii="宋体" w:hAnsi="宋体" w:eastAsia="宋体"/>
+                <w:b w:val="0"/>
+                <w:sz w:val="20"/>
+              </w:rPr>
+              <w:t>请填写职称</w:t>
+            </w:r>
+          </w:p>
+        </w:tc>
+      </w:tr>
+      <w:tr>
+        <w:trPr>
+          <w:trHeight w:val="510" w:hRule="atLeast"/>
+        </w:trPr>
+        <w:tc>
+          <w:tcPr>
+            <w:tcW w:type="dxa" w:w="1020"/>
+            <w:vAlign w:val="center"/>
+          </w:tcPr>
+          <w:p>
+            <w:pPr>
+              <w:spacing w:before="0" w:after="0" w:line="300" w:lineRule="auto"/>
+              <w:jc w:val="center"/>
+            </w:pPr>
+            <w:r/>
+            <w:r>
+              <w:rPr>
+                <w:rFonts w:ascii="宋体" w:hAnsi="宋体" w:eastAsia="宋体"/>
+                <w:b/>
+                <w:sz w:val="24"/>
+              </w:rPr>
+              <w:t>类型</w:t>
+            </w:r>
+          </w:p>
+        </w:tc>
+        <w:tc>
+          <w:tcPr>
+            <w:tcW w:type="dxa" w:w="4421"/>
+            <w:gridSpan w:val="2"/>
+            <w:vAlign w:val="center"/>
+          </w:tcPr>
+          <w:p>
+            <w:pPr>
+              <w:spacing w:before="0" w:after="0" w:line="300" w:lineRule="auto"/>
+              <w:jc w:val="left"/>
+            </w:pPr>
+            <w:r/>
+            <w:r>
+              <w:rPr>
+                <w:rFonts w:ascii="宋体" w:hAnsi="宋体" w:eastAsia="宋体"/>
+                <w:b w:val="0"/>
+                <w:sz w:val="24"/>
+              </w:rPr>
+              <w:t>□论文        □设计</w:t>
+            </w:r>
+          </w:p>
+        </w:tc>
+        <w:tc>
+          <w:tcPr>
+            <w:tcW w:type="dxa" w:w="1417"/>
+            <w:vAlign w:val="center"/>
+          </w:tcPr>
+          <w:p>
+            <w:pPr>
+              <w:spacing w:before="0" w:after="0" w:line="300" w:lineRule="auto"/>
+              <w:jc w:val="center"/>
+            </w:pPr>
+            <w:r/>
+            <w:r>
+              <w:rPr>
+                <w:rFonts w:ascii="宋体" w:hAnsi="宋体" w:eastAsia="宋体"/>
+                <w:b/>
+                <w:sz w:val="24"/>
+              </w:rPr>
+              <w:t>写作语言</w:t>
+            </w:r>
+          </w:p>
+        </w:tc>
+        <w:tc>
+          <w:tcPr>
+            <w:tcW w:type="dxa" w:w="3061"/>
+            <w:gridSpan w:val="2"/>
+            <w:vAlign w:val="center"/>
+          </w:tcPr>
+          <w:p>
+            <w:pPr>
+              <w:spacing w:before="0" w:after="0" w:line="300" w:lineRule="auto"/>
+              <w:jc w:val="left"/>
+            </w:pPr>
+            <w:r/>
+            <w:r>
+              <w:rPr>
+                <w:rFonts w:ascii="宋体" w:hAnsi="宋体" w:eastAsia="宋体"/>
+                <w:b w:val="0"/>
+                <w:sz w:val="24"/>
+              </w:rPr>
+              <w:t>□中文        □其他______</w:t>
+            </w:r>
+          </w:p>
+        </w:tc>
+      </w:tr>
+      <w:tr>
+        <w:trPr>
+          <w:trHeight w:val="510" w:hRule="atLeast"/>
+        </w:trPr>
+        <w:tc>
+          <w:tcPr>
+            <w:tcW w:type="dxa" w:w="1020"/>
+            <w:vAlign w:val="center"/>
+          </w:tcPr>
+          <w:p>
+            <w:pPr>
+              <w:spacing w:before="0" w:after="0" w:line="300" w:lineRule="auto"/>
+              <w:jc w:val="center"/>
+            </w:pPr>
+            <w:r/>
+            <w:r>
+              <w:rPr>
+                <w:rFonts w:ascii="宋体" w:hAnsi="宋体" w:eastAsia="宋体"/>
+                <w:b/>
+                <w:sz w:val="24"/>
+              </w:rPr>
+              <w:t>来源</w:t>
+            </w:r>
+          </w:p>
+        </w:tc>
+        <w:tc>
+          <w:tcPr>
+            <w:tcW w:type="dxa" w:w="4421"/>
+            <w:gridSpan w:val="2"/>
+            <w:vAlign w:val="center"/>
+          </w:tcPr>
+          <w:p>
+            <w:pPr>
+              <w:spacing w:before="0" w:after="0" w:line="300" w:lineRule="auto"/>
+              <w:jc w:val="left"/>
+            </w:pPr>
+            <w:r/>
+            <w:r>
+              <w:rPr>
+                <w:rFonts w:ascii="宋体" w:hAnsi="宋体" w:eastAsia="宋体"/>
+                <w:b w:val="0"/>
+                <w:sz w:val="24"/>
+              </w:rPr>
+              <w:t>□纵向项目    □横向项目</w:t>
+            </w:r>
+            <w:r>
+              <w:br/>
+            </w:r>
+            <w:r>
+              <w:rPr>
+                <w:rFonts w:ascii="宋体" w:hAnsi="宋体" w:eastAsia="宋体"/>
+                <w:b w:val="0"/>
+                <w:sz w:val="24"/>
+              </w:rPr>
+              <w:t>□其它</w:t>
+            </w:r>
+          </w:p>
+        </w:tc>
+        <w:tc>
+          <w:tcPr>
+            <w:tcW w:type="dxa" w:w="1417"/>
+            <w:vAlign w:val="center"/>
+          </w:tcPr>
+          <w:p>
+            <w:pPr>
+              <w:spacing w:before="0" w:after="0" w:line="300" w:lineRule="auto"/>
+              <w:jc w:val="center"/>
+            </w:pPr>
+            <w:r/>
+            <w:r>
+              <w:rPr>
+                <w:rFonts w:ascii="宋体" w:hAnsi="宋体" w:eastAsia="宋体"/>
+                <w:b/>
+                <w:sz w:val="24"/>
+              </w:rPr>
+              <w:t>选题方式</w:t>
+            </w:r>
+          </w:p>
+        </w:tc>
+        <w:tc>
+          <w:tcPr>
+            <w:tcW w:type="dxa" w:w="3061"/>
+            <w:gridSpan w:val="2"/>
+            <w:vAlign w:val="center"/>
+          </w:tcPr>
+          <w:p>
+            <w:pPr>
+              <w:spacing w:before="0" w:after="0" w:line="300" w:lineRule="auto"/>
+              <w:jc w:val="left"/>
+            </w:pPr>
+            <w:r/>
+            <w:r>
+              <w:rPr>
+                <w:rFonts w:ascii="宋体" w:hAnsi="宋体" w:eastAsia="宋体"/>
+                <w:b w:val="0"/>
+                <w:sz w:val="24"/>
+              </w:rPr>
+              <w:t>□导师指定    □自选</w:t>
+            </w:r>
+          </w:p>
+        </w:tc>
+      </w:tr>
+      <w:tr>
+        <w:trPr>
+          <w:trHeight w:val="3912" w:hRule="atLeast"/>
+        </w:trPr>
+        <w:tc>
+          <w:tcPr>
+            <w:tcW w:type="dxa" w:w="1020"/>
+            <w:vAlign w:val="center"/>
+          </w:tcPr>
+          <w:p>
+            <w:pPr>
+              <w:spacing w:before="0" w:after="0" w:line="300" w:lineRule="auto"/>
+              <w:jc w:val="center"/>
+            </w:pPr>
+            <w:r/>
+            <w:r>
+              <w:rPr>
+                <w:rFonts w:ascii="宋体" w:hAnsi="宋体" w:eastAsia="宋体"/>
+                <w:b/>
+                <w:sz w:val="24"/>
+              </w:rPr>
+              <w:t>论</w:t>
+            </w:r>
+            <w:r>
+              <w:br/>
+            </w:r>
+            <w:r>
+              <w:rPr>
+                <w:rFonts w:ascii="宋体" w:hAnsi="宋体" w:eastAsia="宋体"/>
+                <w:b/>
+                <w:sz w:val="24"/>
+              </w:rPr>
+              <w:t>文</w:t>
+            </w:r>
+            <w:r>
+              <w:br/>
+            </w:r>
+            <w:r>
+              <w:rPr>
+                <w:rFonts w:ascii="宋体" w:hAnsi="宋体" w:eastAsia="宋体"/>
+                <w:b/>
+                <w:sz w:val="24"/>
+              </w:rPr>
+              <w:t>写</w:t>
+            </w:r>
+            <w:r>
+              <w:br/>
+            </w:r>
+            <w:r>
+              <w:rPr>
+                <w:rFonts w:ascii="宋体" w:hAnsi="宋体" w:eastAsia="宋体"/>
+                <w:b/>
+                <w:sz w:val="24"/>
+              </w:rPr>
+              <w:t>作</w:t>
+            </w:r>
+            <w:r>
+              <w:br/>
+            </w:r>
+            <w:r>
+              <w:rPr>
+                <w:rFonts w:ascii="宋体" w:hAnsi="宋体" w:eastAsia="宋体"/>
+                <w:b/>
+                <w:sz w:val="24"/>
+              </w:rPr>
+              <w:t>要</w:t>
+            </w:r>
+            <w:r>
+              <w:br/>
+            </w:r>
+            <w:r>
+              <w:rPr>
+                <w:rFonts w:ascii="宋体" w:hAnsi="宋体" w:eastAsia="宋体"/>
+                <w:b/>
+                <w:sz w:val="24"/>
+              </w:rPr>
+              <w:t>求</w:t>
+            </w:r>
+          </w:p>
+        </w:tc>
+        <w:tc>
+          <w:tcPr>
+            <w:tcW w:type="dxa" w:w="8899"/>
+            <w:gridSpan w:val="5"/>
+            <w:vAlign w:val="top"/>
+          </w:tcPr>
+          <w:p>
+            <w:pPr>
+              <w:spacing w:before="0" w:after="0" w:line="300" w:lineRule="auto"/>
+              <w:jc w:val="left"/>
+            </w:pPr>
+            <w:r/>
+            <w:r>
+              <w:rPr>
+                <w:rFonts w:ascii="宋体" w:hAnsi="宋体" w:eastAsia="宋体"/>
+                <w:b w:val="0"/>
+                <w:sz w:val="20"/>
+              </w:rPr>
+              <w:t>写作目标：</w:t>
+            </w:r>
+            <w:r>
+              <w:br/>
+            </w:r>
+            <w:r>
+              <w:rPr>
+                <w:rFonts w:ascii="宋体" w:hAnsi="宋体" w:eastAsia="宋体"/>
+                <w:b w:val="0"/>
+                <w:sz w:val="20"/>
+              </w:rPr>
+            </w:r>
+            <w:r>
+              <w:br/>
+            </w:r>
+            <w:r>
+              <w:rPr>
+                <w:rFonts w:ascii="宋体" w:hAnsi="宋体" w:eastAsia="宋体"/>
+                <w:b w:val="0"/>
+                <w:sz w:val="20"/>
+              </w:rPr>
+              <w:t>写作思路：</w:t>
+            </w:r>
+            <w:r>
+              <w:br/>
+            </w:r>
+            <w:r>
+              <w:rPr>
+                <w:rFonts w:ascii="宋体" w:hAnsi="宋体" w:eastAsia="宋体"/>
+                <w:b w:val="0"/>
+                <w:sz w:val="20"/>
+              </w:rPr>
+            </w:r>
+            <w:r>
+              <w:br/>
+            </w:r>
+            <w:r>
+              <w:rPr>
+                <w:rFonts w:ascii="宋体" w:hAnsi="宋体" w:eastAsia="宋体"/>
+                <w:b w:val="0"/>
+                <w:sz w:val="20"/>
+              </w:rPr>
+              <w:t>研究方法：</w:t>
+            </w:r>
+            <w:r>
+              <w:br/>
+            </w:r>
+            <w:r>
+              <w:rPr>
+                <w:rFonts w:ascii="宋体" w:hAnsi="宋体" w:eastAsia="宋体"/>
+                <w:b w:val="0"/>
+                <w:sz w:val="20"/>
+              </w:rPr>
+            </w:r>
+            <w:r>
+              <w:br/>
+            </w:r>
+            <w:r>
+              <w:rPr>
+                <w:rFonts w:ascii="宋体" w:hAnsi="宋体" w:eastAsia="宋体"/>
+                <w:b w:val="0"/>
+                <w:sz w:val="20"/>
+              </w:rPr>
+              <w:t>进度安排：</w:t>
+            </w:r>
+            <w:r>
+              <w:br/>
+            </w:r>
+            <w:r>
+              <w:rPr>
+                <w:rFonts w:ascii="宋体" w:hAnsi="宋体" w:eastAsia="宋体"/>
+                <w:b w:val="0"/>
+                <w:sz w:val="20"/>
+              </w:rPr>
+            </w:r>
+            <w:r>
+              <w:br/>
+            </w:r>
+            <w:r>
+              <w:rPr>
+                <w:rFonts w:ascii="宋体" w:hAnsi="宋体" w:eastAsia="宋体"/>
+                <w:b w:val="0"/>
+                <w:sz w:val="20"/>
+              </w:rPr>
+            </w:r>
+            <w:r>
+              <w:br/>
+            </w:r>
+            <w:r>
+              <w:rPr>
+                <w:rFonts w:ascii="宋体" w:hAnsi="宋体" w:eastAsia="宋体"/>
+                <w:b w:val="0"/>
+                <w:sz w:val="20"/>
+              </w:rPr>
+            </w:r>
+            <w:r>
+              <w:br/>
+            </w:r>
+            <w:r>
+              <w:rPr>
+                <w:rFonts w:ascii="宋体" w:hAnsi="宋体" w:eastAsia="宋体"/>
+                <w:b w:val="0"/>
+                <w:sz w:val="20"/>
+              </w:rPr>
+            </w:r>
+            <w:r>
+              <w:br/>
+            </w:r>
+            <w:r>
+              <w:rPr>
+                <w:rFonts w:ascii="宋体" w:hAnsi="宋体" w:eastAsia="宋体"/>
+                <w:b w:val="0"/>
+                <w:sz w:val="20"/>
+              </w:rPr>
+            </w:r>
+            <w:r>
+              <w:br/>
+            </w:r>
+            <w:r>
+              <w:rPr>
+                <w:rFonts w:ascii="宋体" w:hAnsi="宋体" w:eastAsia="宋体"/>
+                <w:b w:val="0"/>
+                <w:sz w:val="20"/>
+              </w:rPr>
+            </w:r>
+            <w:r>
+              <w:br/>
+            </w:r>
+            <w:r>
+              <w:rPr>
+                <w:rFonts w:ascii="宋体" w:hAnsi="宋体" w:eastAsia="宋体"/>
+                <w:b w:val="0"/>
+                <w:sz w:val="20"/>
+              </w:rPr>
+            </w:r>
+            <w:r>
+              <w:br/>
+            </w:r>
+            <w:r>
+              <w:rPr>
+                <w:rFonts w:ascii="宋体" w:hAnsi="宋体" w:eastAsia="宋体"/>
+                <w:b w:val="0"/>
+                <w:sz w:val="20"/>
+              </w:rPr>
+            </w:r>
+            <w:r>
+              <w:br/>
+            </w:r>
+            <w:r>
+              <w:rPr>
+                <w:rFonts w:ascii="宋体" w:hAnsi="宋体" w:eastAsia="宋体"/>
+                <w:b w:val="0"/>
+                <w:sz w:val="20"/>
+              </w:rPr>
+            </w:r>
+          </w:p>
+        </w:tc>
+      </w:tr>
+      <w:tr>
+        <w:trPr>
+          <w:trHeight w:val="4195" w:hRule="atLeast"/>
+        </w:trPr>
+        <w:tc>
+          <w:tcPr>
+            <w:tcW w:type="dxa" w:w="1020"/>
+            <w:vAlign w:val="center"/>
+          </w:tcPr>
+          <w:p>
+            <w:pPr>
+              <w:spacing w:before="0" w:after="0" w:line="300" w:lineRule="auto"/>
+              <w:jc w:val="center"/>
+            </w:pPr>
+            <w:r/>
+            <w:r>
+              <w:rPr>
+                <w:rFonts w:ascii="宋体" w:hAnsi="宋体" w:eastAsia="宋体"/>
+                <w:b/>
+                <w:sz w:val="24"/>
+              </w:rPr>
+              <w:t>支</w:t>
+            </w:r>
+            <w:r>
+              <w:br/>
+            </w:r>
+            <w:r>
+              <w:rPr>
+                <w:rFonts w:ascii="宋体" w:hAnsi="宋体" w:eastAsia="宋体"/>
+                <w:b/>
+                <w:sz w:val="24"/>
+              </w:rPr>
+              <w:t>持</w:t>
+            </w:r>
+            <w:r>
+              <w:br/>
+            </w:r>
+            <w:r>
+              <w:rPr>
+                <w:rFonts w:ascii="宋体" w:hAnsi="宋体" w:eastAsia="宋体"/>
+                <w:b/>
+                <w:sz w:val="24"/>
+              </w:rPr>
+              <w:t>条</w:t>
+            </w:r>
+            <w:r>
+              <w:br/>
+            </w:r>
+            <w:r>
+              <w:rPr>
+                <w:rFonts w:ascii="宋体" w:hAnsi="宋体" w:eastAsia="宋体"/>
+                <w:b/>
+                <w:sz w:val="24"/>
+              </w:rPr>
+              <w:t>件</w:t>
+            </w:r>
+          </w:p>
+        </w:tc>
+        <w:tc>
+          <w:tcPr>
+            <w:tcW w:type="dxa" w:w="8899"/>
+            <w:gridSpan w:val="5"/>
+            <w:vAlign w:val="top"/>
+          </w:tcPr>
+          <w:p>
+            <w:pPr>
+              <w:spacing w:before="0" w:after="0" w:line="300" w:lineRule="auto"/>
+              <w:jc w:val="left"/>
+            </w:pPr>
+            <w:r/>
+            <w:r>
+              <w:rPr>
+                <w:rFonts w:ascii="宋体" w:hAnsi="宋体" w:eastAsia="宋体"/>
+                <w:b w:val="0"/>
+                <w:sz w:val="20"/>
+              </w:rPr>
+              <w:t>请填写完成论文所需的研究基础、实验条件、数据资料、平台支持等。</w:t>
+            </w:r>
+            <w:r>
+              <w:br/>
+            </w:r>
+            <w:r>
+              <w:rPr>
+                <w:rFonts w:ascii="宋体" w:hAnsi="宋体" w:eastAsia="宋体"/>
+                <w:b w:val="0"/>
+                <w:sz w:val="20"/>
+              </w:rPr>
+            </w:r>
+            <w:r>
+              <w:br/>
+            </w:r>
+            <w:r>
+              <w:rPr>
+                <w:rFonts w:ascii="宋体" w:hAnsi="宋体" w:eastAsia="宋体"/>
+                <w:b w:val="0"/>
+                <w:sz w:val="20"/>
+              </w:rPr>
+            </w:r>
+            <w:r>
+              <w:br/>
+            </w:r>
+            <w:r>
+              <w:rPr>
+                <w:rFonts w:ascii="宋体" w:hAnsi="宋体" w:eastAsia="宋体"/>
+                <w:b w:val="0"/>
+                <w:sz w:val="20"/>
+              </w:rPr>
+            </w:r>
+            <w:r>
+              <w:br/>
+            </w:r>
+            <w:r>
+              <w:rPr>
+                <w:rFonts w:ascii="宋体" w:hAnsi="宋体" w:eastAsia="宋体"/>
+                <w:b w:val="0"/>
+                <w:sz w:val="20"/>
+              </w:rPr>
+            </w:r>
+            <w:r>
+              <w:br/>
+            </w:r>
+            <w:r>
+              <w:rPr>
+                <w:rFonts w:ascii="宋体" w:hAnsi="宋体" w:eastAsia="宋体"/>
+                <w:b w:val="0"/>
+                <w:sz w:val="20"/>
+              </w:rPr>
+            </w:r>
+            <w:r>
+              <w:br/>
+            </w:r>
+            <w:r>
+              <w:rPr>
+                <w:rFonts w:ascii="宋体" w:hAnsi="宋体" w:eastAsia="宋体"/>
+                <w:b w:val="0"/>
+                <w:sz w:val="20"/>
+              </w:rPr>
+            </w:r>
+            <w:r>
+              <w:br/>
+            </w:r>
+            <w:r>
+              <w:rPr>
+                <w:rFonts w:ascii="宋体" w:hAnsi="宋体" w:eastAsia="宋体"/>
+                <w:b w:val="0"/>
+                <w:sz w:val="20"/>
+              </w:rPr>
+            </w:r>
+            <w:r>
+              <w:br/>
+            </w:r>
+            <w:r>
+              <w:rPr>
+                <w:rFonts w:ascii="宋体" w:hAnsi="宋体" w:eastAsia="宋体"/>
+                <w:b w:val="0"/>
+                <w:sz w:val="20"/>
+              </w:rPr>
+            </w:r>
+            <w:r>
+              <w:br/>
+            </w:r>
+            <w:r>
+              <w:rPr>
+                <w:rFonts w:ascii="宋体" w:hAnsi="宋体" w:eastAsia="宋体"/>
+                <w:b w:val="0"/>
+                <w:sz w:val="20"/>
+              </w:rPr>
+            </w:r>
+            <w:r>
+              <w:br/>
+            </w:r>
+            <w:r>
+              <w:rPr>
+                <w:rFonts w:ascii="宋体" w:hAnsi="宋体" w:eastAsia="宋体"/>
+                <w:b w:val="0"/>
+                <w:sz w:val="20"/>
+              </w:rPr>
+            </w:r>
+            <w:r>
+              <w:br/>
+            </w:r>
+            <w:r>
+              <w:rPr>
+                <w:rFonts w:ascii="宋体" w:hAnsi="宋体" w:eastAsia="宋体"/>
+                <w:b w:val="0"/>
+                <w:sz w:val="20"/>
+              </w:rPr>
+            </w:r>
+          </w:p>
+        </w:tc>
+      </w:tr>
+      <w:tr>
+        <w:trPr>
+          <w:trHeight w:val="680" w:hRule="atLeast"/>
+        </w:trPr>
+        <w:tc>
+          <w:tcPr>
+            <w:tcW w:type="dxa" w:w="1020"/>
+            <w:vAlign w:val="center"/>
+          </w:tcPr>
+          <w:p>
+            <w:pPr>
+              <w:spacing w:before="0" w:after="0" w:line="300" w:lineRule="auto"/>
+              <w:jc w:val="center"/>
+            </w:pPr>
+            <w:r/>
+            <w:r>
+              <w:rPr>
+                <w:rFonts w:ascii="宋体" w:hAnsi="宋体" w:eastAsia="宋体"/>
+                <w:b/>
+                <w:sz w:val="24"/>
+              </w:rPr>
+              <w:t>指导</w:t>
+            </w:r>
+            <w:r>
+              <w:br/>
+            </w:r>
+            <w:r>
+              <w:rPr>
+                <w:rFonts w:ascii="宋体" w:hAnsi="宋体" w:eastAsia="宋体"/>
+                <w:b/>
+                <w:sz w:val="24"/>
+              </w:rPr>
+              <w:t>教师</w:t>
+            </w:r>
+            <w:r>
+              <w:br/>
+            </w:r>
+            <w:r>
+              <w:rPr>
+                <w:rFonts w:ascii="宋体" w:hAnsi="宋体" w:eastAsia="宋体"/>
+                <w:b/>
+                <w:sz w:val="24"/>
+              </w:rPr>
+              <w:t>意见</w:t>
+            </w:r>
+          </w:p>
+        </w:tc>
+        <w:tc>
+          <w:tcPr>
+            <w:tcW w:type="dxa" w:w="8899"/>
+            <w:gridSpan w:val="5"/>
+            <w:vAlign w:val="top"/>
+          </w:tcPr>
+          <w:p>
+            <w:pPr>
+              <w:spacing w:before="0" w:after="0" w:line="300" w:lineRule="auto"/>
+              <w:jc w:val="left"/>
+            </w:pPr>
+            <w:r/>
+            <w:r>
+              <w:rPr>
+                <w:rFonts w:ascii="宋体" w:hAnsi="宋体" w:eastAsia="宋体"/>
+                <w:b w:val="0"/>
+                <w:sz w:val="20"/>
+              </w:rPr>
+              <w:t>请填写指导教师意见。</w:t>
+            </w:r>
+          </w:p>
+        </w:tc>
+      </w:tr>
+      <w:tr>
+        <w:trPr>
+          <w:trHeight w:val="2154" w:hRule="atLeast"/>
+        </w:trPr>
+        <w:tc>
+          <w:tcPr>
+            <w:tcW w:type="dxa" w:w="1020"/>
+            <w:vAlign w:val="center"/>
+          </w:tcPr>
+          <w:p>
+            <w:pPr>
+              <w:spacing w:before="0" w:after="0" w:line="300" w:lineRule="auto"/>
+              <w:jc w:val="center"/>
+            </w:pPr>
+            <w:r/>
+            <w:r>
+              <w:rPr>
+                <w:rFonts w:ascii="宋体" w:hAnsi="宋体" w:eastAsia="宋体"/>
+                <w:b/>
+                <w:sz w:val="24"/>
+              </w:rPr>
+              <w:t>签名</w:t>
+            </w:r>
+            <w:r>
+              <w:br/>
+            </w:r>
+            <w:r>
+              <w:rPr>
+                <w:rFonts w:ascii="宋体" w:hAnsi="宋体" w:eastAsia="宋体"/>
+                <w:b/>
+                <w:sz w:val="24"/>
+              </w:rPr>
+              <w:t>日期</w:t>
+            </w:r>
+          </w:p>
+        </w:tc>
+        <w:tc>
+          <w:tcPr>
+            <w:tcW w:type="dxa" w:w="8899"/>
+            <w:gridSpan w:val="5"/>
+            <w:vAlign w:val="bottom"/>
+          </w:tcPr>
+          <w:p>
+            <w:pPr>
+              <w:spacing w:before="0" w:after="0" w:line="300" w:lineRule="auto"/>
+              <w:jc w:val="right"/>
+            </w:pPr>
+            <w:r/>
+            <w:r>
+              <w:rPr>
+                <w:rFonts w:ascii="宋体" w:hAnsi="宋体" w:eastAsia="宋体"/>
+                <w:b w:val="0"/>
+                <w:sz w:val="22"/>
+              </w:rPr>
+              <w:t>指导教师签名：                年    月    日</w:t>
+            </w:r>
+          </w:p>
+        </w:tc>
+      </w:tr>
+    </w:tbl>
+    <w:p>
+      <w:r>
+        <w:br w:type="page"/>
       </w:r>
     </w:p>
     <w:p>
       <w:pPr>
-        <w:sectPr>
-          <w:pgSz w:w="11906" w:h="16838"/>
-          <w:pgMar w:top="0" w:right="0" w:bottom="0" w:left="0" w:header="0" w:footer="0" w:gutter="0"/>
-          <w:cols w:space="720"/>
-          <w:docGrid w:linePitch="360"/>
-        </w:sectPr>
-      </w:pPr>
-    </w:p>
-    <w:p>
-      <w:pPr>
-        <w:spacing w:before="0" w:after="0" w:line="240" w:lineRule="auto"/>
+        <w:spacing w:before="0" w:after="200"/>
         <w:jc w:val="center"/>
       </w:pPr>
       <w:r>
-        <w:drawing>
-          <wp:inline xmlns:a="http://schemas.openxmlformats.org/drawingml/2006/main" xmlns:pic="http://schemas.openxmlformats.org/drawingml/2006/picture">
-            <wp:extent cx="7560000" cy="10692000"/>
-            <wp:docPr id="2" name="Picture 2"/>
-            <wp:cNvGraphicFramePr>
-              <a:graphicFrameLocks noChangeAspect="1"/>
-            </wp:cNvGraphicFramePr>
-            <a:graphic>
-              <a:graphicData uri="http://schemas.openxmlformats.org/drawingml/2006/picture">
-                <pic:pic>
-                  <pic:nvPicPr>
-                    <pic:cNvPr id="0" name="本科毕业论文任务书.docx-2.png"/>
-                    <pic:cNvPicPr/>
-                  </pic:nvPicPr>
-                  <pic:blipFill>
-                    <a:blip r:embed="rId10"/>
-                    <a:stretch>
-                      <a:fillRect/>
-                    </a:stretch>
-                  </pic:blipFill>
-                  <pic:spPr>
-                    <a:xfrm>
-                      <a:off x="0" y="0"/>
-                      <a:ext cx="7560000" cy="10692000"/>
-                    </a:xfrm>
-                    <a:prstGeom prst="rect"/>
-                  </pic:spPr>
-                </pic:pic>
-              </a:graphicData>
-            </a:graphic>
-          </wp:inline>
-        </w:drawing>
+        <w:rPr>
+          <w:rFonts w:ascii="黑体" w:hAnsi="黑体" w:eastAsia="黑体"/>
+          <w:b/>
+          <w:sz w:val="36"/>
+        </w:rPr>
+        <w:t>任务书（续）</w:t>
       </w:r>
     </w:p>
+    <w:tbl>
+      <w:tblPr>
+        <w:tblW w:type="auto" w:w="0"/>
+        <w:jc w:val="center"/>
+        <w:tblLayout w:type="fixed"/>
+        <w:tblLook w:firstColumn="1" w:firstRow="1" w:lastColumn="0" w:lastRow="0" w:noHBand="0" w:noVBand="1" w:val="04A0"/>
+        <w:tblBorders>
+          <w:top w:val="single" w:sz="12" w:space="0" w:color="000000"/>
+          <w:left w:val="single" w:sz="12" w:space="0" w:color="000000"/>
+          <w:bottom w:val="single" w:sz="12" w:space="0" w:color="000000"/>
+          <w:right w:val="single" w:sz="12" w:space="0" w:color="000000"/>
+          <w:insideH w:val="single" w:sz="12" w:space="0" w:color="000000"/>
+          <w:insideV w:val="single" w:sz="12" w:space="0" w:color="000000"/>
+        </w:tblBorders>
+      </w:tblPr>
+      <w:tblGrid>
+        <w:gridCol w:w="4933"/>
+        <w:gridCol w:w="4933"/>
+      </w:tblGrid>
+      <w:tr>
+        <w:trPr>
+          <w:trHeight w:val="4819" w:hRule="atLeast"/>
+        </w:trPr>
+        <w:tc>
+          <w:tcPr>
+            <w:tcW w:type="dxa" w:w="1360"/>
+            <w:vAlign w:val="center"/>
+          </w:tcPr>
+          <w:p>
+            <w:pPr>
+              <w:spacing w:before="0" w:after="0" w:line="300" w:lineRule="auto"/>
+              <w:jc w:val="center"/>
+            </w:pPr>
+            <w:r/>
+            <w:r>
+              <w:rPr>
+                <w:rFonts w:ascii="宋体" w:hAnsi="宋体" w:eastAsia="宋体"/>
+                <w:b/>
+                <w:sz w:val="24"/>
+              </w:rPr>
+              <w:t>主</w:t>
+            </w:r>
+            <w:r>
+              <w:br/>
+            </w:r>
+            <w:r>
+              <w:rPr>
+                <w:rFonts w:ascii="宋体" w:hAnsi="宋体" w:eastAsia="宋体"/>
+                <w:b/>
+                <w:sz w:val="24"/>
+              </w:rPr>
+              <w:t>要</w:t>
+            </w:r>
+            <w:r>
+              <w:br/>
+            </w:r>
+            <w:r>
+              <w:rPr>
+                <w:rFonts w:ascii="宋体" w:hAnsi="宋体" w:eastAsia="宋体"/>
+                <w:b/>
+                <w:sz w:val="24"/>
+              </w:rPr>
+              <w:t>参</w:t>
+            </w:r>
+            <w:r>
+              <w:br/>
+            </w:r>
+            <w:r>
+              <w:rPr>
+                <w:rFonts w:ascii="宋体" w:hAnsi="宋体" w:eastAsia="宋体"/>
+                <w:b/>
+                <w:sz w:val="24"/>
+              </w:rPr>
+              <w:t>考</w:t>
+            </w:r>
+            <w:r>
+              <w:br/>
+            </w:r>
+            <w:r>
+              <w:rPr>
+                <w:rFonts w:ascii="宋体" w:hAnsi="宋体" w:eastAsia="宋体"/>
+                <w:b/>
+                <w:sz w:val="24"/>
+              </w:rPr>
+              <w:t>文</w:t>
+            </w:r>
+            <w:r>
+              <w:br/>
+            </w:r>
+            <w:r>
+              <w:rPr>
+                <w:rFonts w:ascii="宋体" w:hAnsi="宋体" w:eastAsia="宋体"/>
+                <w:b/>
+                <w:sz w:val="24"/>
+              </w:rPr>
+              <w:t>献</w:t>
+            </w:r>
+          </w:p>
+        </w:tc>
+        <w:tc>
+          <w:tcPr>
+            <w:tcW w:type="dxa" w:w="8391"/>
+            <w:vAlign w:val="top"/>
+          </w:tcPr>
+          <w:p>
+            <w:pPr>
+              <w:spacing w:before="0" w:after="0" w:line="300" w:lineRule="auto"/>
+              <w:jc w:val="left"/>
+            </w:pPr>
+            <w:r/>
+            <w:r>
+              <w:rPr>
+                <w:rFonts w:ascii="宋体" w:hAnsi="宋体" w:eastAsia="宋体"/>
+                <w:b w:val="0"/>
+                <w:sz w:val="20"/>
+              </w:rPr>
+              <w:t>请填写主要参考文献。</w:t>
+            </w:r>
+            <w:r>
+              <w:br/>
+            </w:r>
+            <w:r>
+              <w:rPr>
+                <w:rFonts w:ascii="宋体" w:hAnsi="宋体" w:eastAsia="宋体"/>
+                <w:b w:val="0"/>
+                <w:sz w:val="20"/>
+              </w:rPr>
+            </w:r>
+            <w:r>
+              <w:br/>
+            </w:r>
+            <w:r>
+              <w:rPr>
+                <w:rFonts w:ascii="宋体" w:hAnsi="宋体" w:eastAsia="宋体"/>
+                <w:b w:val="0"/>
+                <w:sz w:val="20"/>
+              </w:rPr>
+            </w:r>
+            <w:r>
+              <w:br/>
+            </w:r>
+            <w:r>
+              <w:rPr>
+                <w:rFonts w:ascii="宋体" w:hAnsi="宋体" w:eastAsia="宋体"/>
+                <w:b w:val="0"/>
+                <w:sz w:val="20"/>
+              </w:rPr>
+            </w:r>
+            <w:r>
+              <w:br/>
+            </w:r>
+            <w:r>
+              <w:rPr>
+                <w:rFonts w:ascii="宋体" w:hAnsi="宋体" w:eastAsia="宋体"/>
+                <w:b w:val="0"/>
+                <w:sz w:val="20"/>
+              </w:rPr>
+            </w:r>
+            <w:r>
+              <w:br/>
+            </w:r>
+            <w:r>
+              <w:rPr>
+                <w:rFonts w:ascii="宋体" w:hAnsi="宋体" w:eastAsia="宋体"/>
+                <w:b w:val="0"/>
+                <w:sz w:val="20"/>
+              </w:rPr>
+            </w:r>
+            <w:r>
+              <w:br/>
+            </w:r>
+            <w:r>
+              <w:rPr>
+                <w:rFonts w:ascii="宋体" w:hAnsi="宋体" w:eastAsia="宋体"/>
+                <w:b w:val="0"/>
+                <w:sz w:val="20"/>
+              </w:rPr>
+            </w:r>
+            <w:r>
+              <w:br/>
+            </w:r>
+            <w:r>
+              <w:rPr>
+                <w:rFonts w:ascii="宋体" w:hAnsi="宋体" w:eastAsia="宋体"/>
+                <w:b w:val="0"/>
+                <w:sz w:val="20"/>
+              </w:rPr>
+            </w:r>
+            <w:r>
+              <w:br/>
+            </w:r>
+            <w:r>
+              <w:rPr>
+                <w:rFonts w:ascii="宋体" w:hAnsi="宋体" w:eastAsia="宋体"/>
+                <w:b w:val="0"/>
+                <w:sz w:val="20"/>
+              </w:rPr>
+            </w:r>
+            <w:r>
+              <w:br/>
+            </w:r>
+            <w:r>
+              <w:rPr>
+                <w:rFonts w:ascii="宋体" w:hAnsi="宋体" w:eastAsia="宋体"/>
+                <w:b w:val="0"/>
+                <w:sz w:val="20"/>
+              </w:rPr>
+            </w:r>
+            <w:r>
+              <w:br/>
+            </w:r>
+            <w:r>
+              <w:rPr>
+                <w:rFonts w:ascii="宋体" w:hAnsi="宋体" w:eastAsia="宋体"/>
+                <w:b w:val="0"/>
+                <w:sz w:val="20"/>
+              </w:rPr>
+            </w:r>
+            <w:r>
+              <w:br/>
+            </w:r>
+            <w:r>
+              <w:rPr>
+                <w:rFonts w:ascii="宋体" w:hAnsi="宋体" w:eastAsia="宋体"/>
+                <w:b w:val="0"/>
+                <w:sz w:val="20"/>
+              </w:rPr>
+            </w:r>
+          </w:p>
+        </w:tc>
+      </w:tr>
+      <w:tr>
+        <w:trPr>
+          <w:trHeight w:val="4819" w:hRule="atLeast"/>
+        </w:trPr>
+        <w:tc>
+          <w:tcPr>
+            <w:tcW w:type="dxa" w:w="1360"/>
+            <w:vAlign w:val="center"/>
+          </w:tcPr>
+          <w:p>
+            <w:pPr>
+              <w:spacing w:before="0" w:after="0" w:line="300" w:lineRule="auto"/>
+              <w:jc w:val="center"/>
+            </w:pPr>
+            <w:r/>
+            <w:r>
+              <w:rPr>
+                <w:rFonts w:ascii="宋体" w:hAnsi="宋体" w:eastAsia="宋体"/>
+                <w:b/>
+                <w:sz w:val="24"/>
+              </w:rPr>
+              <w:t>进</w:t>
+            </w:r>
+            <w:r>
+              <w:br/>
+            </w:r>
+            <w:r>
+              <w:rPr>
+                <w:rFonts w:ascii="宋体" w:hAnsi="宋体" w:eastAsia="宋体"/>
+                <w:b/>
+                <w:sz w:val="24"/>
+              </w:rPr>
+              <w:t>度</w:t>
+            </w:r>
+            <w:r>
+              <w:br/>
+            </w:r>
+            <w:r>
+              <w:rPr>
+                <w:rFonts w:ascii="宋体" w:hAnsi="宋体" w:eastAsia="宋体"/>
+                <w:b/>
+                <w:sz w:val="24"/>
+              </w:rPr>
+              <w:t>安</w:t>
+            </w:r>
+            <w:r>
+              <w:br/>
+            </w:r>
+            <w:r>
+              <w:rPr>
+                <w:rFonts w:ascii="宋体" w:hAnsi="宋体" w:eastAsia="宋体"/>
+                <w:b/>
+                <w:sz w:val="24"/>
+              </w:rPr>
+              <w:t>排</w:t>
+            </w:r>
+          </w:p>
+        </w:tc>
+        <w:tc>
+          <w:tcPr>
+            <w:tcW w:type="dxa" w:w="8391"/>
+            <w:vAlign w:val="top"/>
+          </w:tcPr>
+          <w:p>
+            <w:pPr>
+              <w:spacing w:before="0" w:after="0" w:line="300" w:lineRule="auto"/>
+              <w:jc w:val="left"/>
+            </w:pPr>
+            <w:r/>
+            <w:r>
+              <w:rPr>
+                <w:rFonts w:ascii="宋体" w:hAnsi="宋体" w:eastAsia="宋体"/>
+                <w:b w:val="0"/>
+                <w:sz w:val="20"/>
+              </w:rPr>
+              <w:t>请按时间节点填写论文工作进度安排。</w:t>
+            </w:r>
+            <w:r>
+              <w:br/>
+            </w:r>
+            <w:r>
+              <w:rPr>
+                <w:rFonts w:ascii="宋体" w:hAnsi="宋体" w:eastAsia="宋体"/>
+                <w:b w:val="0"/>
+                <w:sz w:val="20"/>
+              </w:rPr>
+            </w:r>
+            <w:r>
+              <w:br/>
+            </w:r>
+            <w:r>
+              <w:rPr>
+                <w:rFonts w:ascii="宋体" w:hAnsi="宋体" w:eastAsia="宋体"/>
+                <w:b w:val="0"/>
+                <w:sz w:val="20"/>
+              </w:rPr>
+            </w:r>
+            <w:r>
+              <w:br/>
+            </w:r>
+            <w:r>
+              <w:rPr>
+                <w:rFonts w:ascii="宋体" w:hAnsi="宋体" w:eastAsia="宋体"/>
+                <w:b w:val="0"/>
+                <w:sz w:val="20"/>
+              </w:rPr>
+            </w:r>
+            <w:r>
+              <w:br/>
+            </w:r>
+            <w:r>
+              <w:rPr>
+                <w:rFonts w:ascii="宋体" w:hAnsi="宋体" w:eastAsia="宋体"/>
+                <w:b w:val="0"/>
+                <w:sz w:val="20"/>
+              </w:rPr>
+            </w:r>
+            <w:r>
+              <w:br/>
+            </w:r>
+            <w:r>
+              <w:rPr>
+                <w:rFonts w:ascii="宋体" w:hAnsi="宋体" w:eastAsia="宋体"/>
+                <w:b w:val="0"/>
+                <w:sz w:val="20"/>
+              </w:rPr>
+            </w:r>
+            <w:r>
+              <w:br/>
+            </w:r>
+            <w:r>
+              <w:rPr>
+                <w:rFonts w:ascii="宋体" w:hAnsi="宋体" w:eastAsia="宋体"/>
+                <w:b w:val="0"/>
+                <w:sz w:val="20"/>
+              </w:rPr>
+            </w:r>
+            <w:r>
+              <w:br/>
+            </w:r>
+            <w:r>
+              <w:rPr>
+                <w:rFonts w:ascii="宋体" w:hAnsi="宋体" w:eastAsia="宋体"/>
+                <w:b w:val="0"/>
+                <w:sz w:val="20"/>
+              </w:rPr>
+            </w:r>
+            <w:r>
+              <w:br/>
+            </w:r>
+            <w:r>
+              <w:rPr>
+                <w:rFonts w:ascii="宋体" w:hAnsi="宋体" w:eastAsia="宋体"/>
+                <w:b w:val="0"/>
+                <w:sz w:val="20"/>
+              </w:rPr>
+            </w:r>
+            <w:r>
+              <w:br/>
+            </w:r>
+            <w:r>
+              <w:rPr>
+                <w:rFonts w:ascii="宋体" w:hAnsi="宋体" w:eastAsia="宋体"/>
+                <w:b w:val="0"/>
+                <w:sz w:val="20"/>
+              </w:rPr>
+            </w:r>
+            <w:r>
+              <w:br/>
+            </w:r>
+            <w:r>
+              <w:rPr>
+                <w:rFonts w:ascii="宋体" w:hAnsi="宋体" w:eastAsia="宋体"/>
+                <w:b w:val="0"/>
+                <w:sz w:val="20"/>
+              </w:rPr>
+            </w:r>
+            <w:r>
+              <w:br/>
+            </w:r>
+            <w:r>
+              <w:rPr>
+                <w:rFonts w:ascii="宋体" w:hAnsi="宋体" w:eastAsia="宋体"/>
+                <w:b w:val="0"/>
+                <w:sz w:val="20"/>
+              </w:rPr>
+            </w:r>
+          </w:p>
+        </w:tc>
+      </w:tr>
+      <w:tr>
+        <w:trPr>
+          <w:trHeight w:val="1417" w:hRule="atLeast"/>
+        </w:trPr>
+        <w:tc>
+          <w:tcPr>
+            <w:tcW w:type="dxa" w:w="1360"/>
+            <w:vAlign w:val="center"/>
+          </w:tcPr>
+          <w:p>
+            <w:pPr>
+              <w:spacing w:before="0" w:after="0" w:line="300" w:lineRule="auto"/>
+              <w:jc w:val="center"/>
+            </w:pPr>
+            <w:r/>
+            <w:r>
+              <w:rPr>
+                <w:rFonts w:ascii="宋体" w:hAnsi="宋体" w:eastAsia="宋体"/>
+                <w:b/>
+                <w:sz w:val="24"/>
+              </w:rPr>
+              <w:t>学生</w:t>
+            </w:r>
+            <w:r>
+              <w:br/>
+            </w:r>
+            <w:r>
+              <w:rPr>
+                <w:rFonts w:ascii="宋体" w:hAnsi="宋体" w:eastAsia="宋体"/>
+                <w:b/>
+                <w:sz w:val="24"/>
+              </w:rPr>
+              <w:t>签名</w:t>
+            </w:r>
+          </w:p>
+        </w:tc>
+        <w:tc>
+          <w:tcPr>
+            <w:tcW w:type="dxa" w:w="8391"/>
+            <w:vAlign w:val="bottom"/>
+          </w:tcPr>
+          <w:p>
+            <w:pPr>
+              <w:spacing w:before="0" w:after="0" w:line="300" w:lineRule="auto"/>
+              <w:jc w:val="right"/>
+            </w:pPr>
+            <w:r/>
+            <w:r>
+              <w:rPr>
+                <w:rFonts w:ascii="宋体" w:hAnsi="宋体" w:eastAsia="宋体"/>
+                <w:b w:val="0"/>
+                <w:sz w:val="22"/>
+              </w:rPr>
+              <w:t>学生签名：                年    月    日</w:t>
+            </w:r>
+          </w:p>
+        </w:tc>
+      </w:tr>
+      <w:tr>
+        <w:trPr>
+          <w:trHeight w:val="1417" w:hRule="atLeast"/>
+        </w:trPr>
+        <w:tc>
+          <w:tcPr>
+            <w:tcW w:type="dxa" w:w="1360"/>
+            <w:vAlign w:val="center"/>
+          </w:tcPr>
+          <w:p>
+            <w:pPr>
+              <w:spacing w:before="0" w:after="0" w:line="300" w:lineRule="auto"/>
+              <w:jc w:val="center"/>
+            </w:pPr>
+            <w:r/>
+            <w:r>
+              <w:rPr>
+                <w:rFonts w:ascii="宋体" w:hAnsi="宋体" w:eastAsia="宋体"/>
+                <w:b/>
+                <w:sz w:val="24"/>
+              </w:rPr>
+              <w:t>学院</w:t>
+            </w:r>
+            <w:r>
+              <w:br/>
+            </w:r>
+            <w:r>
+              <w:rPr>
+                <w:rFonts w:ascii="宋体" w:hAnsi="宋体" w:eastAsia="宋体"/>
+                <w:b/>
+                <w:sz w:val="24"/>
+              </w:rPr>
+              <w:t>意见</w:t>
+            </w:r>
+          </w:p>
+        </w:tc>
+        <w:tc>
+          <w:tcPr>
+            <w:tcW w:type="dxa" w:w="8391"/>
+            <w:vAlign w:val="bottom"/>
+          </w:tcPr>
+          <w:p>
+            <w:pPr>
+              <w:spacing w:before="0" w:after="0" w:line="300" w:lineRule="auto"/>
+              <w:jc w:val="right"/>
+            </w:pPr>
+            <w:r/>
+            <w:r>
+              <w:rPr>
+                <w:rFonts w:ascii="宋体" w:hAnsi="宋体" w:eastAsia="宋体"/>
+                <w:b w:val="0"/>
+                <w:sz w:val="22"/>
+              </w:rPr>
+              <w:t>负责人签名：              年    月    日</w:t>
+            </w:r>
+          </w:p>
+        </w:tc>
+      </w:tr>
+    </w:tbl>
     <w:sectPr>
       <w:pgSz w:w="11906" w:h="16838"/>
-      <w:pgMar w:top="0" w:right="0" w:bottom="0" w:left="0" w:header="0" w:footer="0" w:gutter="0"/>
+      <w:pgMar w:top="907" w:right="1020" w:bottom="850" w:left="1020" w:header="454" w:footer="454" w:gutter="0"/>
       <w:cols w:space="720"/>
       <w:docGrid w:linePitch="360"/>
     </w:sectPr>
@@ -465,6 +1980,10 @@
     <w:name w:val="Normal"/>
     <w:qFormat/>
     <w:rsid w:val="00FC693F"/>
+    <w:rPr>
+      <w:rFonts w:ascii="宋体" w:hAnsi="宋体" w:eastAsia="宋体"/>
+      <w:sz w:val="22"/>
+    </w:rPr>
   </w:style>
   <w:style w:type="paragraph" w:styleId="Header">
     <w:name w:val="header"/>

</xml_diff>

<commit_message>
Align editable templates with specification layout
Agent-Logs-Url: https://github.com/wkybill/process/sessions/c0d4e0e1-b680-49b0-95d5-35d9a48c343f

Co-authored-by: wkybill <151885169+wkybill@users.noreply.github.com>
</commit_message>
<xml_diff>
--- a/本科毕业论文任务书.docx
+++ b/本科毕业论文任务书.docx
@@ -4,14 +4,14 @@
   <w:body>
     <w:p>
       <w:pPr>
-        <w:spacing w:before="0" w:after="200"/>
+        <w:spacing w:after="160" w:before="0"/>
         <w:jc w:val="center"/>
       </w:pPr>
       <w:r>
         <w:rPr>
           <w:rFonts w:ascii="黑体" w:hAnsi="黑体" w:eastAsia="黑体"/>
           <w:b/>
-          <w:sz w:val="44"/>
+          <w:sz w:val="40"/>
         </w:rPr>
         <w:t>任务书</w:t>
       </w:r>
@@ -23,34 +23,34 @@
         <w:tblLayout w:type="fixed"/>
         <w:tblLook w:firstColumn="1" w:firstRow="1" w:lastColumn="0" w:lastRow="0" w:noHBand="0" w:noVBand="1" w:val="04A0"/>
         <w:tblBorders>
-          <w:top w:val="single" w:sz="12" w:space="0" w:color="000000"/>
-          <w:left w:val="single" w:sz="12" w:space="0" w:color="000000"/>
-          <w:bottom w:val="single" w:sz="12" w:space="0" w:color="000000"/>
-          <w:right w:val="single" w:sz="12" w:space="0" w:color="000000"/>
-          <w:insideH w:val="single" w:sz="12" w:space="0" w:color="000000"/>
-          <w:insideV w:val="single" w:sz="12" w:space="0" w:color="000000"/>
+          <w:top w:val="single" w:sz="10" w:space="0" w:color="000000"/>
+          <w:left w:val="single" w:sz="10" w:space="0" w:color="000000"/>
+          <w:bottom w:val="single" w:sz="10" w:space="0" w:color="000000"/>
+          <w:right w:val="single" w:sz="10" w:space="0" w:color="000000"/>
+          <w:insideH w:val="single" w:sz="10" w:space="0" w:color="000000"/>
+          <w:insideV w:val="single" w:sz="10" w:space="0" w:color="000000"/>
         </w:tblBorders>
       </w:tblPr>
       <w:tblGrid>
-        <w:gridCol w:w="1644"/>
-        <w:gridCol w:w="1644"/>
-        <w:gridCol w:w="1644"/>
-        <w:gridCol w:w="1644"/>
-        <w:gridCol w:w="1644"/>
-        <w:gridCol w:w="1644"/>
+        <w:gridCol w:w="1673"/>
+        <w:gridCol w:w="1673"/>
+        <w:gridCol w:w="1673"/>
+        <w:gridCol w:w="1673"/>
+        <w:gridCol w:w="1673"/>
+        <w:gridCol w:w="1673"/>
       </w:tblGrid>
       <w:tr>
         <w:trPr>
-          <w:trHeight w:val="567" w:hRule="atLeast"/>
+          <w:trHeight w:val="510" w:hRule="atLeast"/>
         </w:trPr>
         <w:tc>
           <w:tcPr>
-            <w:tcW w:type="dxa" w:w="1020"/>
+            <w:tcW w:type="dxa" w:w="878"/>
             <w:vAlign w:val="center"/>
           </w:tcPr>
           <w:p>
             <w:pPr>
-              <w:spacing w:before="0" w:after="0" w:line="300" w:lineRule="auto"/>
+              <w:spacing w:before="0" w:after="0" w:line="276" w:lineRule="auto"/>
               <w:jc w:val="center"/>
             </w:pPr>
             <w:r/>
@@ -58,7 +58,7 @@
               <w:rPr>
                 <w:rFonts w:ascii="宋体" w:hAnsi="宋体" w:eastAsia="宋体"/>
                 <w:b/>
-                <w:sz w:val="24"/>
+                <w:sz w:val="22"/>
               </w:rPr>
               <w:t>题目</w:t>
             </w:r>
@@ -66,13 +66,13 @@
         </w:tc>
         <w:tc>
           <w:tcPr>
-            <w:tcW w:type="dxa" w:w="8899"/>
+            <w:tcW w:type="dxa" w:w="9155"/>
             <w:gridSpan w:val="5"/>
-            <w:vAlign w:val="top"/>
+            <w:vAlign w:val="center"/>
           </w:tcPr>
           <w:p>
             <w:pPr>
-              <w:spacing w:before="0" w:after="0" w:line="300" w:lineRule="auto"/>
+              <w:spacing w:before="0" w:after="0" w:line="276" w:lineRule="auto"/>
               <w:jc w:val="left"/>
             </w:pPr>
             <w:r/>
@@ -80,25 +80,80 @@
               <w:rPr>
                 <w:rFonts w:ascii="宋体" w:hAnsi="宋体" w:eastAsia="宋体"/>
                 <w:b w:val="0"/>
-                <w:sz w:val="20"/>
+                <w:sz w:val="22"/>
               </w:rPr>
-              <w:t>请填写论文题目</w:t>
+            </w:r>
+          </w:p>
+          <w:p>
+            <w:pPr>
+              <w:spacing w:before="0" w:after="0" w:line="276" w:lineRule="auto"/>
+              <w:jc w:val="left"/>
+            </w:pPr>
+            <w:r/>
+            <w:r>
+              <w:rPr>
+                <w:rFonts w:ascii="宋体" w:hAnsi="宋体" w:eastAsia="宋体"/>
+                <w:b w:val="0"/>
+                <w:sz w:val="22"/>
+              </w:rPr>
+            </w:r>
+          </w:p>
+          <w:p>
+            <w:pPr>
+              <w:spacing w:before="0" w:after="0" w:line="276" w:lineRule="auto"/>
+              <w:jc w:val="left"/>
+            </w:pPr>
+            <w:r/>
+            <w:r>
+              <w:rPr>
+                <w:rFonts w:ascii="宋体" w:hAnsi="宋体" w:eastAsia="宋体"/>
+                <w:b w:val="0"/>
+                <w:sz w:val="22"/>
+              </w:rPr>
+            </w:r>
+          </w:p>
+          <w:p>
+            <w:pPr>
+              <w:spacing w:before="0" w:after="0" w:line="276" w:lineRule="auto"/>
+              <w:jc w:val="left"/>
+            </w:pPr>
+            <w:r/>
+            <w:r>
+              <w:rPr>
+                <w:rFonts w:ascii="宋体" w:hAnsi="宋体" w:eastAsia="宋体"/>
+                <w:b w:val="0"/>
+                <w:sz w:val="22"/>
+              </w:rPr>
+            </w:r>
+          </w:p>
+          <w:p>
+            <w:pPr>
+              <w:spacing w:before="0" w:after="0" w:line="276" w:lineRule="auto"/>
+              <w:jc w:val="left"/>
+            </w:pPr>
+            <w:r/>
+            <w:r>
+              <w:rPr>
+                <w:rFonts w:ascii="宋体" w:hAnsi="宋体" w:eastAsia="宋体"/>
+                <w:b w:val="0"/>
+                <w:sz w:val="22"/>
+              </w:rPr>
             </w:r>
           </w:p>
         </w:tc>
       </w:tr>
       <w:tr>
         <w:trPr>
-          <w:trHeight w:val="510" w:hRule="atLeast"/>
+          <w:trHeight w:val="425" w:hRule="atLeast"/>
         </w:trPr>
         <w:tc>
           <w:tcPr>
-            <w:tcW w:type="dxa" w:w="1020"/>
+            <w:tcW w:type="dxa" w:w="878"/>
             <w:vAlign w:val="center"/>
           </w:tcPr>
           <w:p>
             <w:pPr>
-              <w:spacing w:before="0" w:after="0" w:line="300" w:lineRule="auto"/>
+              <w:spacing w:before="0" w:after="0" w:line="276" w:lineRule="auto"/>
               <w:jc w:val="center"/>
             </w:pPr>
             <w:r/>
@@ -106,7 +161,7 @@
               <w:rPr>
                 <w:rFonts w:ascii="宋体" w:hAnsi="宋体" w:eastAsia="宋体"/>
                 <w:b/>
-                <w:sz w:val="24"/>
+                <w:sz w:val="22"/>
               </w:rPr>
               <w:t>姓名</w:t>
             </w:r>
@@ -116,11 +171,11 @@
           <w:tcPr>
             <w:tcW w:type="dxa" w:w="4421"/>
             <w:gridSpan w:val="2"/>
-            <w:vAlign w:val="top"/>
+            <w:vAlign w:val="center"/>
           </w:tcPr>
           <w:p>
             <w:pPr>
-              <w:spacing w:before="0" w:after="0" w:line="300" w:lineRule="auto"/>
+              <w:spacing w:before="0" w:after="0" w:line="276" w:lineRule="auto"/>
               <w:jc w:val="left"/>
             </w:pPr>
             <w:r/>
@@ -128,20 +183,33 @@
               <w:rPr>
                 <w:rFonts w:ascii="宋体" w:hAnsi="宋体" w:eastAsia="宋体"/>
                 <w:b w:val="0"/>
-                <w:sz w:val="20"/>
+                <w:sz w:val="22"/>
               </w:rPr>
-              <w:t>请填写姓名</w:t>
+            </w:r>
+          </w:p>
+          <w:p>
+            <w:pPr>
+              <w:spacing w:before="0" w:after="0" w:line="276" w:lineRule="auto"/>
+              <w:jc w:val="left"/>
+            </w:pPr>
+            <w:r/>
+            <w:r>
+              <w:rPr>
+                <w:rFonts w:ascii="宋体" w:hAnsi="宋体" w:eastAsia="宋体"/>
+                <w:b w:val="0"/>
+                <w:sz w:val="22"/>
+              </w:rPr>
             </w:r>
           </w:p>
         </w:tc>
         <w:tc>
           <w:tcPr>
-            <w:tcW w:type="dxa" w:w="1417"/>
+            <w:tcW w:type="dxa" w:w="1134"/>
             <w:vAlign w:val="center"/>
           </w:tcPr>
           <w:p>
             <w:pPr>
-              <w:spacing w:before="0" w:after="0" w:line="300" w:lineRule="auto"/>
+              <w:spacing w:before="0" w:after="0" w:line="276" w:lineRule="auto"/>
               <w:jc w:val="center"/>
             </w:pPr>
             <w:r/>
@@ -149,7 +217,7 @@
               <w:rPr>
                 <w:rFonts w:ascii="宋体" w:hAnsi="宋体" w:eastAsia="宋体"/>
                 <w:b/>
-                <w:sz w:val="24"/>
+                <w:sz w:val="22"/>
               </w:rPr>
               <w:t>学号</w:t>
             </w:r>
@@ -157,13 +225,13 @@
         </w:tc>
         <w:tc>
           <w:tcPr>
-            <w:tcW w:type="dxa" w:w="3061"/>
+            <w:tcW w:type="dxa" w:w="3600"/>
             <w:gridSpan w:val="2"/>
-            <w:vAlign w:val="top"/>
+            <w:vAlign w:val="center"/>
           </w:tcPr>
           <w:p>
             <w:pPr>
-              <w:spacing w:before="0" w:after="0" w:line="300" w:lineRule="auto"/>
+              <w:spacing w:before="0" w:after="0" w:line="276" w:lineRule="auto"/>
               <w:jc w:val="left"/>
             </w:pPr>
             <w:r/>
@@ -171,25 +239,38 @@
               <w:rPr>
                 <w:rFonts w:ascii="宋体" w:hAnsi="宋体" w:eastAsia="宋体"/>
                 <w:b w:val="0"/>
-                <w:sz w:val="20"/>
+                <w:sz w:val="22"/>
               </w:rPr>
-              <w:t>请填写学号</w:t>
+            </w:r>
+          </w:p>
+          <w:p>
+            <w:pPr>
+              <w:spacing w:before="0" w:after="0" w:line="276" w:lineRule="auto"/>
+              <w:jc w:val="left"/>
+            </w:pPr>
+            <w:r/>
+            <w:r>
+              <w:rPr>
+                <w:rFonts w:ascii="宋体" w:hAnsi="宋体" w:eastAsia="宋体"/>
+                <w:b w:val="0"/>
+                <w:sz w:val="22"/>
+              </w:rPr>
             </w:r>
           </w:p>
         </w:tc>
       </w:tr>
       <w:tr>
         <w:trPr>
-          <w:trHeight w:val="680" w:hRule="atLeast"/>
+          <w:trHeight w:val="481" w:hRule="atLeast"/>
         </w:trPr>
         <w:tc>
           <w:tcPr>
-            <w:tcW w:type="dxa" w:w="1020"/>
+            <w:tcW w:type="dxa" w:w="878"/>
             <w:vAlign w:val="center"/>
           </w:tcPr>
           <w:p>
             <w:pPr>
-              <w:spacing w:before="0" w:after="0" w:line="300" w:lineRule="auto"/>
+              <w:spacing w:before="0" w:after="0" w:line="240" w:lineRule="auto"/>
               <w:jc w:val="center"/>
             </w:pPr>
             <w:r/>
@@ -197,9 +278,9 @@
               <w:rPr>
                 <w:rFonts w:ascii="宋体" w:hAnsi="宋体" w:eastAsia="宋体"/>
                 <w:b/>
-                <w:sz w:val="24"/>
+                <w:sz w:val="22"/>
               </w:rPr>
-              <w:t>指导</w:t>
+              <w:t>指</w:t>
             </w:r>
             <w:r>
               <w:br/>
@@ -208,9 +289,31 @@
               <w:rPr>
                 <w:rFonts w:ascii="宋体" w:hAnsi="宋体" w:eastAsia="宋体"/>
                 <w:b/>
-                <w:sz w:val="24"/>
+                <w:sz w:val="22"/>
               </w:rPr>
-              <w:t>教师</w:t>
+              <w:t>导</w:t>
+            </w:r>
+            <w:r>
+              <w:br/>
+            </w:r>
+            <w:r>
+              <w:rPr>
+                <w:rFonts w:ascii="宋体" w:hAnsi="宋体" w:eastAsia="宋体"/>
+                <w:b/>
+                <w:sz w:val="22"/>
+              </w:rPr>
+              <w:t>教</w:t>
+            </w:r>
+            <w:r>
+              <w:br/>
+            </w:r>
+            <w:r>
+              <w:rPr>
+                <w:rFonts w:ascii="宋体" w:hAnsi="宋体" w:eastAsia="宋体"/>
+                <w:b/>
+                <w:sz w:val="22"/>
+              </w:rPr>
+              <w:t>师</w:t>
             </w:r>
           </w:p>
         </w:tc>
@@ -218,11 +321,11 @@
           <w:tcPr>
             <w:tcW w:type="dxa" w:w="4421"/>
             <w:gridSpan w:val="2"/>
-            <w:vAlign w:val="top"/>
+            <w:vAlign w:val="center"/>
           </w:tcPr>
           <w:p>
             <w:pPr>
-              <w:spacing w:before="0" w:after="0" w:line="300" w:lineRule="auto"/>
+              <w:spacing w:before="0" w:after="0" w:line="276" w:lineRule="auto"/>
               <w:jc w:val="left"/>
             </w:pPr>
             <w:r/>
@@ -230,20 +333,33 @@
               <w:rPr>
                 <w:rFonts w:ascii="宋体" w:hAnsi="宋体" w:eastAsia="宋体"/>
                 <w:b w:val="0"/>
-                <w:sz w:val="20"/>
+                <w:sz w:val="22"/>
               </w:rPr>
-              <w:t>请填写指导教师</w:t>
+            </w:r>
+          </w:p>
+          <w:p>
+            <w:pPr>
+              <w:spacing w:before="0" w:after="0" w:line="276" w:lineRule="auto"/>
+              <w:jc w:val="left"/>
+            </w:pPr>
+            <w:r/>
+            <w:r>
+              <w:rPr>
+                <w:rFonts w:ascii="宋体" w:hAnsi="宋体" w:eastAsia="宋体"/>
+                <w:b w:val="0"/>
+                <w:sz w:val="22"/>
+              </w:rPr>
             </w:r>
           </w:p>
         </w:tc>
         <w:tc>
           <w:tcPr>
-            <w:tcW w:type="dxa" w:w="1417"/>
+            <w:tcW w:type="dxa" w:w="1134"/>
             <w:vAlign w:val="center"/>
           </w:tcPr>
           <w:p>
             <w:pPr>
-              <w:spacing w:before="0" w:after="0" w:line="300" w:lineRule="auto"/>
+              <w:spacing w:before="0" w:after="0" w:line="276" w:lineRule="auto"/>
               <w:jc w:val="center"/>
             </w:pPr>
             <w:r/>
@@ -251,7 +367,7 @@
               <w:rPr>
                 <w:rFonts w:ascii="宋体" w:hAnsi="宋体" w:eastAsia="宋体"/>
                 <w:b/>
-                <w:sz w:val="24"/>
+                <w:sz w:val="22"/>
               </w:rPr>
               <w:t>职称</w:t>
             </w:r>
@@ -259,13 +375,13 @@
         </w:tc>
         <w:tc>
           <w:tcPr>
-            <w:tcW w:type="dxa" w:w="3061"/>
+            <w:tcW w:type="dxa" w:w="3600"/>
             <w:gridSpan w:val="2"/>
-            <w:vAlign w:val="top"/>
+            <w:vAlign w:val="center"/>
           </w:tcPr>
           <w:p>
             <w:pPr>
-              <w:spacing w:before="0" w:after="0" w:line="300" w:lineRule="auto"/>
+              <w:spacing w:before="0" w:after="0" w:line="276" w:lineRule="auto"/>
               <w:jc w:val="left"/>
             </w:pPr>
             <w:r/>
@@ -273,25 +389,38 @@
               <w:rPr>
                 <w:rFonts w:ascii="宋体" w:hAnsi="宋体" w:eastAsia="宋体"/>
                 <w:b w:val="0"/>
-                <w:sz w:val="20"/>
+                <w:sz w:val="22"/>
               </w:rPr>
-              <w:t>请填写职称</w:t>
+            </w:r>
+          </w:p>
+          <w:p>
+            <w:pPr>
+              <w:spacing w:before="0" w:after="0" w:line="276" w:lineRule="auto"/>
+              <w:jc w:val="left"/>
+            </w:pPr>
+            <w:r/>
+            <w:r>
+              <w:rPr>
+                <w:rFonts w:ascii="宋体" w:hAnsi="宋体" w:eastAsia="宋体"/>
+                <w:b w:val="0"/>
+                <w:sz w:val="22"/>
+              </w:rPr>
             </w:r>
           </w:p>
         </w:tc>
       </w:tr>
       <w:tr>
         <w:trPr>
-          <w:trHeight w:val="510" w:hRule="atLeast"/>
+          <w:trHeight w:val="481" w:hRule="atLeast"/>
         </w:trPr>
         <w:tc>
           <w:tcPr>
-            <w:tcW w:type="dxa" w:w="1020"/>
+            <w:tcW w:type="dxa" w:w="878"/>
             <w:vAlign w:val="center"/>
           </w:tcPr>
           <w:p>
             <w:pPr>
-              <w:spacing w:before="0" w:after="0" w:line="300" w:lineRule="auto"/>
+              <w:spacing w:before="0" w:after="0" w:line="276" w:lineRule="auto"/>
               <w:jc w:val="center"/>
             </w:pPr>
             <w:r/>
@@ -299,7 +428,7 @@
               <w:rPr>
                 <w:rFonts w:ascii="宋体" w:hAnsi="宋体" w:eastAsia="宋体"/>
                 <w:b/>
-                <w:sz w:val="24"/>
+                <w:sz w:val="22"/>
               </w:rPr>
               <w:t>类型</w:t>
             </w:r>
@@ -313,7 +442,50 @@
           </w:tcPr>
           <w:p>
             <w:pPr>
-              <w:spacing w:before="0" w:after="0" w:line="300" w:lineRule="auto"/>
+              <w:spacing w:before="0" w:after="0" w:line="276" w:lineRule="auto"/>
+              <w:jc w:val="center"/>
+            </w:pPr>
+            <w:r/>
+            <w:r>
+              <w:rPr>
+                <w:rFonts w:ascii="宋体" w:hAnsi="宋体" w:eastAsia="宋体"/>
+                <w:b w:val="0"/>
+                <w:sz w:val="22"/>
+              </w:rPr>
+              <w:t>□论文    □设计</w:t>
+            </w:r>
+          </w:p>
+        </w:tc>
+        <w:tc>
+          <w:tcPr>
+            <w:tcW w:type="dxa" w:w="1134"/>
+            <w:vAlign w:val="center"/>
+          </w:tcPr>
+          <w:p>
+            <w:pPr>
+              <w:spacing w:before="0" w:after="0" w:line="276" w:lineRule="auto"/>
+              <w:jc w:val="center"/>
+            </w:pPr>
+            <w:r/>
+            <w:r>
+              <w:rPr>
+                <w:rFonts w:ascii="宋体" w:hAnsi="宋体" w:eastAsia="宋体"/>
+                <w:b/>
+                <w:sz w:val="22"/>
+              </w:rPr>
+              <w:t>写作语言</w:t>
+            </w:r>
+          </w:p>
+        </w:tc>
+        <w:tc>
+          <w:tcPr>
+            <w:tcW w:type="dxa" w:w="3600"/>
+            <w:gridSpan w:val="2"/>
+            <w:vAlign w:val="center"/>
+          </w:tcPr>
+          <w:p>
+            <w:pPr>
+              <w:spacing w:before="0" w:after="0" w:line="276" w:lineRule="auto"/>
               <w:jc w:val="left"/>
             </w:pPr>
             <w:r/>
@@ -321,20 +493,38 @@
               <w:rPr>
                 <w:rFonts w:ascii="宋体" w:hAnsi="宋体" w:eastAsia="宋体"/>
                 <w:b w:val="0"/>
-                <w:sz w:val="24"/>
+                <w:sz w:val="22"/>
               </w:rPr>
-              <w:t>□论文        □设计</w:t>
+            </w:r>
+          </w:p>
+          <w:p>
+            <w:pPr>
+              <w:spacing w:before="0" w:after="0" w:line="276" w:lineRule="auto"/>
+              <w:jc w:val="left"/>
+            </w:pPr>
+            <w:r/>
+            <w:r>
+              <w:rPr>
+                <w:rFonts w:ascii="宋体" w:hAnsi="宋体" w:eastAsia="宋体"/>
+                <w:b w:val="0"/>
+                <w:sz w:val="22"/>
+              </w:rPr>
             </w:r>
           </w:p>
         </w:tc>
+      </w:tr>
+      <w:tr>
+        <w:trPr>
+          <w:trHeight w:val="481" w:hRule="atLeast"/>
+        </w:trPr>
         <w:tc>
           <w:tcPr>
-            <w:tcW w:type="dxa" w:w="1417"/>
+            <w:tcW w:type="dxa" w:w="878"/>
             <w:vAlign w:val="center"/>
           </w:tcPr>
           <w:p>
             <w:pPr>
-              <w:spacing w:before="0" w:after="0" w:line="300" w:lineRule="auto"/>
+              <w:spacing w:before="0" w:after="0" w:line="276" w:lineRule="auto"/>
               <w:jc w:val="center"/>
             </w:pPr>
             <w:r/>
@@ -342,55 +532,7 @@
               <w:rPr>
                 <w:rFonts w:ascii="宋体" w:hAnsi="宋体" w:eastAsia="宋体"/>
                 <w:b/>
-                <w:sz w:val="24"/>
-              </w:rPr>
-              <w:t>写作语言</w:t>
-            </w:r>
-          </w:p>
-        </w:tc>
-        <w:tc>
-          <w:tcPr>
-            <w:tcW w:type="dxa" w:w="3061"/>
-            <w:gridSpan w:val="2"/>
-            <w:vAlign w:val="center"/>
-          </w:tcPr>
-          <w:p>
-            <w:pPr>
-              <w:spacing w:before="0" w:after="0" w:line="300" w:lineRule="auto"/>
-              <w:jc w:val="left"/>
-            </w:pPr>
-            <w:r/>
-            <w:r>
-              <w:rPr>
-                <w:rFonts w:ascii="宋体" w:hAnsi="宋体" w:eastAsia="宋体"/>
-                <w:b w:val="0"/>
-                <w:sz w:val="24"/>
-              </w:rPr>
-              <w:t>□中文        □其他______</w:t>
-            </w:r>
-          </w:p>
-        </w:tc>
-      </w:tr>
-      <w:tr>
-        <w:trPr>
-          <w:trHeight w:val="510" w:hRule="atLeast"/>
-        </w:trPr>
-        <w:tc>
-          <w:tcPr>
-            <w:tcW w:type="dxa" w:w="1020"/>
-            <w:vAlign w:val="center"/>
-          </w:tcPr>
-          <w:p>
-            <w:pPr>
-              <w:spacing w:before="0" w:after="0" w:line="300" w:lineRule="auto"/>
-              <w:jc w:val="center"/>
-            </w:pPr>
-            <w:r/>
-            <w:r>
-              <w:rPr>
-                <w:rFonts w:ascii="宋体" w:hAnsi="宋体" w:eastAsia="宋体"/>
-                <w:b/>
-                <w:sz w:val="24"/>
+                <w:sz w:val="22"/>
               </w:rPr>
               <w:t>来源</w:t>
             </w:r>
@@ -404,17 +546,17 @@
           </w:tcPr>
           <w:p>
             <w:pPr>
-              <w:spacing w:before="0" w:after="0" w:line="300" w:lineRule="auto"/>
-              <w:jc w:val="left"/>
+              <w:spacing w:before="0" w:after="0" w:line="276" w:lineRule="auto"/>
+              <w:jc w:val="center"/>
             </w:pPr>
             <w:r/>
             <w:r>
               <w:rPr>
                 <w:rFonts w:ascii="宋体" w:hAnsi="宋体" w:eastAsia="宋体"/>
                 <w:b w:val="0"/>
-                <w:sz w:val="24"/>
+                <w:sz w:val="22"/>
               </w:rPr>
-              <w:t>□纵向项目    □横向项目</w:t>
+              <w:t>□纵向项目  □横向项目</w:t>
             </w:r>
             <w:r>
               <w:br/>
@@ -423,7 +565,7 @@
               <w:rPr>
                 <w:rFonts w:ascii="宋体" w:hAnsi="宋体" w:eastAsia="宋体"/>
                 <w:b w:val="0"/>
-                <w:sz w:val="24"/>
+                <w:sz w:val="22"/>
               </w:rPr>
               <w:t>□其它</w:t>
             </w:r>
@@ -431,12 +573,12 @@
         </w:tc>
         <w:tc>
           <w:tcPr>
-            <w:tcW w:type="dxa" w:w="1417"/>
+            <w:tcW w:type="dxa" w:w="1134"/>
             <w:vAlign w:val="center"/>
           </w:tcPr>
           <w:p>
             <w:pPr>
-              <w:spacing w:before="0" w:after="0" w:line="300" w:lineRule="auto"/>
+              <w:spacing w:before="0" w:after="0" w:line="276" w:lineRule="auto"/>
               <w:jc w:val="center"/>
             </w:pPr>
             <w:r/>
@@ -444,7 +586,7 @@
               <w:rPr>
                 <w:rFonts w:ascii="宋体" w:hAnsi="宋体" w:eastAsia="宋体"/>
                 <w:b/>
-                <w:sz w:val="24"/>
+                <w:sz w:val="22"/>
               </w:rPr>
               <w:t>选题方式</w:t>
             </w:r>
@@ -452,21 +594,21 @@
         </w:tc>
         <w:tc>
           <w:tcPr>
-            <w:tcW w:type="dxa" w:w="3061"/>
+            <w:tcW w:type="dxa" w:w="3600"/>
             <w:gridSpan w:val="2"/>
             <w:vAlign w:val="center"/>
           </w:tcPr>
           <w:p>
             <w:pPr>
-              <w:spacing w:before="0" w:after="0" w:line="300" w:lineRule="auto"/>
-              <w:jc w:val="left"/>
+              <w:spacing w:before="0" w:after="0" w:line="276" w:lineRule="auto"/>
+              <w:jc w:val="center"/>
             </w:pPr>
             <w:r/>
             <w:r>
               <w:rPr>
                 <w:rFonts w:ascii="宋体" w:hAnsi="宋体" w:eastAsia="宋体"/>
                 <w:b w:val="0"/>
-                <w:sz w:val="24"/>
+                <w:sz w:val="22"/>
               </w:rPr>
               <w:t>□导师指定    □自选</w:t>
             </w:r>
@@ -475,16 +617,16 @@
       </w:tr>
       <w:tr>
         <w:trPr>
-          <w:trHeight w:val="3912" w:hRule="atLeast"/>
+          <w:trHeight w:val="3798" w:hRule="atLeast"/>
         </w:trPr>
         <w:tc>
           <w:tcPr>
-            <w:tcW w:type="dxa" w:w="1020"/>
+            <w:tcW w:type="dxa" w:w="878"/>
             <w:vAlign w:val="center"/>
           </w:tcPr>
           <w:p>
             <w:pPr>
-              <w:spacing w:before="0" w:after="0" w:line="300" w:lineRule="auto"/>
+              <w:spacing w:before="0" w:after="0" w:line="240" w:lineRule="auto"/>
               <w:jc w:val="center"/>
             </w:pPr>
             <w:r/>
@@ -492,7 +634,7 @@
               <w:rPr>
                 <w:rFonts w:ascii="宋体" w:hAnsi="宋体" w:eastAsia="宋体"/>
                 <w:b/>
-                <w:sz w:val="24"/>
+                <w:sz w:val="22"/>
               </w:rPr>
               <w:t>论</w:t>
             </w:r>
@@ -503,7 +645,7 @@
               <w:rPr>
                 <w:rFonts w:ascii="宋体" w:hAnsi="宋体" w:eastAsia="宋体"/>
                 <w:b/>
-                <w:sz w:val="24"/>
+                <w:sz w:val="22"/>
               </w:rPr>
               <w:t>文</w:t>
             </w:r>
@@ -514,7 +656,7 @@
               <w:rPr>
                 <w:rFonts w:ascii="宋体" w:hAnsi="宋体" w:eastAsia="宋体"/>
                 <w:b/>
-                <w:sz w:val="24"/>
+                <w:sz w:val="22"/>
               </w:rPr>
               <w:t>写</w:t>
             </w:r>
@@ -525,7 +667,7 @@
               <w:rPr>
                 <w:rFonts w:ascii="宋体" w:hAnsi="宋体" w:eastAsia="宋体"/>
                 <w:b/>
-                <w:sz w:val="24"/>
+                <w:sz w:val="22"/>
               </w:rPr>
               <w:t>作</w:t>
             </w:r>
@@ -536,7 +678,7 @@
               <w:rPr>
                 <w:rFonts w:ascii="宋体" w:hAnsi="宋体" w:eastAsia="宋体"/>
                 <w:b/>
-                <w:sz w:val="24"/>
+                <w:sz w:val="22"/>
               </w:rPr>
               <w:t>要</w:t>
             </w:r>
@@ -547,7 +689,7 @@
               <w:rPr>
                 <w:rFonts w:ascii="宋体" w:hAnsi="宋体" w:eastAsia="宋体"/>
                 <w:b/>
-                <w:sz w:val="24"/>
+                <w:sz w:val="22"/>
               </w:rPr>
               <w:t>求</w:t>
             </w:r>
@@ -555,13 +697,13 @@
         </w:tc>
         <w:tc>
           <w:tcPr>
-            <w:tcW w:type="dxa" w:w="8899"/>
+            <w:tcW w:type="dxa" w:w="9155"/>
             <w:gridSpan w:val="5"/>
-            <w:vAlign w:val="top"/>
+            <w:vAlign w:val="center"/>
           </w:tcPr>
           <w:p>
             <w:pPr>
-              <w:spacing w:before="0" w:after="0" w:line="300" w:lineRule="auto"/>
+              <w:spacing w:before="0" w:after="0" w:line="276" w:lineRule="auto"/>
               <w:jc w:val="left"/>
             </w:pPr>
             <w:r/>
@@ -569,161 +711,63 @@
               <w:rPr>
                 <w:rFonts w:ascii="宋体" w:hAnsi="宋体" w:eastAsia="宋体"/>
                 <w:b w:val="0"/>
-                <w:sz w:val="20"/>
+                <w:sz w:val="22"/>
               </w:rPr>
-              <w:t>写作目标：</w:t>
             </w:r>
-            <w:r>
-              <w:br/>
-            </w:r>
+          </w:p>
+          <w:p>
+            <w:pPr>
+              <w:spacing w:before="0" w:after="0" w:line="276" w:lineRule="auto"/>
+              <w:jc w:val="left"/>
+            </w:pPr>
+            <w:r/>
             <w:r>
               <w:rPr>
                 <w:rFonts w:ascii="宋体" w:hAnsi="宋体" w:eastAsia="宋体"/>
                 <w:b w:val="0"/>
-                <w:sz w:val="20"/>
+                <w:sz w:val="22"/>
               </w:rPr>
             </w:r>
-            <w:r>
-              <w:br/>
-            </w:r>
+          </w:p>
+          <w:p>
+            <w:pPr>
+              <w:spacing w:before="0" w:after="0" w:line="276" w:lineRule="auto"/>
+              <w:jc w:val="left"/>
+            </w:pPr>
+            <w:r/>
             <w:r>
               <w:rPr>
                 <w:rFonts w:ascii="宋体" w:hAnsi="宋体" w:eastAsia="宋体"/>
                 <w:b w:val="0"/>
-                <w:sz w:val="20"/>
+                <w:sz w:val="22"/>
               </w:rPr>
-              <w:t>写作思路：</w:t>
             </w:r>
-            <w:r>
-              <w:br/>
-            </w:r>
+          </w:p>
+          <w:p>
+            <w:pPr>
+              <w:spacing w:before="0" w:after="0" w:line="276" w:lineRule="auto"/>
+              <w:jc w:val="left"/>
+            </w:pPr>
+            <w:r/>
             <w:r>
               <w:rPr>
                 <w:rFonts w:ascii="宋体" w:hAnsi="宋体" w:eastAsia="宋体"/>
                 <w:b w:val="0"/>
-                <w:sz w:val="20"/>
+                <w:sz w:val="22"/>
               </w:rPr>
             </w:r>
-            <w:r>
-              <w:br/>
-            </w:r>
+          </w:p>
+          <w:p>
+            <w:pPr>
+              <w:spacing w:before="0" w:after="0" w:line="276" w:lineRule="auto"/>
+              <w:jc w:val="left"/>
+            </w:pPr>
+            <w:r/>
             <w:r>
               <w:rPr>
                 <w:rFonts w:ascii="宋体" w:hAnsi="宋体" w:eastAsia="宋体"/>
                 <w:b w:val="0"/>
-                <w:sz w:val="20"/>
-              </w:rPr>
-              <w:t>研究方法：</w:t>
-            </w:r>
-            <w:r>
-              <w:br/>
-            </w:r>
-            <w:r>
-              <w:rPr>
-                <w:rFonts w:ascii="宋体" w:hAnsi="宋体" w:eastAsia="宋体"/>
-                <w:b w:val="0"/>
-                <w:sz w:val="20"/>
-              </w:rPr>
-            </w:r>
-            <w:r>
-              <w:br/>
-            </w:r>
-            <w:r>
-              <w:rPr>
-                <w:rFonts w:ascii="宋体" w:hAnsi="宋体" w:eastAsia="宋体"/>
-                <w:b w:val="0"/>
-                <w:sz w:val="20"/>
-              </w:rPr>
-              <w:t>进度安排：</w:t>
-            </w:r>
-            <w:r>
-              <w:br/>
-            </w:r>
-            <w:r>
-              <w:rPr>
-                <w:rFonts w:ascii="宋体" w:hAnsi="宋体" w:eastAsia="宋体"/>
-                <w:b w:val="0"/>
-                <w:sz w:val="20"/>
-              </w:rPr>
-            </w:r>
-            <w:r>
-              <w:br/>
-            </w:r>
-            <w:r>
-              <w:rPr>
-                <w:rFonts w:ascii="宋体" w:hAnsi="宋体" w:eastAsia="宋体"/>
-                <w:b w:val="0"/>
-                <w:sz w:val="20"/>
-              </w:rPr>
-            </w:r>
-            <w:r>
-              <w:br/>
-            </w:r>
-            <w:r>
-              <w:rPr>
-                <w:rFonts w:ascii="宋体" w:hAnsi="宋体" w:eastAsia="宋体"/>
-                <w:b w:val="0"/>
-                <w:sz w:val="20"/>
-              </w:rPr>
-            </w:r>
-            <w:r>
-              <w:br/>
-            </w:r>
-            <w:r>
-              <w:rPr>
-                <w:rFonts w:ascii="宋体" w:hAnsi="宋体" w:eastAsia="宋体"/>
-                <w:b w:val="0"/>
-                <w:sz w:val="20"/>
-              </w:rPr>
-            </w:r>
-            <w:r>
-              <w:br/>
-            </w:r>
-            <w:r>
-              <w:rPr>
-                <w:rFonts w:ascii="宋体" w:hAnsi="宋体" w:eastAsia="宋体"/>
-                <w:b w:val="0"/>
-                <w:sz w:val="20"/>
-              </w:rPr>
-            </w:r>
-            <w:r>
-              <w:br/>
-            </w:r>
-            <w:r>
-              <w:rPr>
-                <w:rFonts w:ascii="宋体" w:hAnsi="宋体" w:eastAsia="宋体"/>
-                <w:b w:val="0"/>
-                <w:sz w:val="20"/>
-              </w:rPr>
-            </w:r>
-            <w:r>
-              <w:br/>
-            </w:r>
-            <w:r>
-              <w:rPr>
-                <w:rFonts w:ascii="宋体" w:hAnsi="宋体" w:eastAsia="宋体"/>
-                <w:b w:val="0"/>
-                <w:sz w:val="20"/>
-              </w:rPr>
-            </w:r>
-            <w:r>
-              <w:br/>
-            </w:r>
-            <w:r>
-              <w:rPr>
-                <w:rFonts w:ascii="宋体" w:hAnsi="宋体" w:eastAsia="宋体"/>
-                <w:b w:val="0"/>
-                <w:sz w:val="20"/>
-              </w:rPr>
-            </w:r>
-            <w:r>
-              <w:br/>
-            </w:r>
-            <w:r>
-              <w:rPr>
-                <w:rFonts w:ascii="宋体" w:hAnsi="宋体" w:eastAsia="宋体"/>
-                <w:b w:val="0"/>
-                <w:sz w:val="20"/>
+                <w:sz w:val="22"/>
               </w:rPr>
             </w:r>
           </w:p>
@@ -731,16 +775,16 @@
       </w:tr>
       <w:tr>
         <w:trPr>
-          <w:trHeight w:val="4195" w:hRule="atLeast"/>
+          <w:trHeight w:val="3061" w:hRule="atLeast"/>
         </w:trPr>
         <w:tc>
           <w:tcPr>
-            <w:tcW w:type="dxa" w:w="1020"/>
+            <w:tcW w:type="dxa" w:w="878"/>
             <w:vAlign w:val="center"/>
           </w:tcPr>
           <w:p>
             <w:pPr>
-              <w:spacing w:before="0" w:after="0" w:line="300" w:lineRule="auto"/>
+              <w:spacing w:before="0" w:after="0" w:line="240" w:lineRule="auto"/>
               <w:jc w:val="center"/>
             </w:pPr>
             <w:r/>
@@ -748,7 +792,7 @@
               <w:rPr>
                 <w:rFonts w:ascii="宋体" w:hAnsi="宋体" w:eastAsia="宋体"/>
                 <w:b/>
-                <w:sz w:val="24"/>
+                <w:sz w:val="22"/>
               </w:rPr>
               <w:t>支</w:t>
             </w:r>
@@ -759,7 +803,7 @@
               <w:rPr>
                 <w:rFonts w:ascii="宋体" w:hAnsi="宋体" w:eastAsia="宋体"/>
                 <w:b/>
-                <w:sz w:val="24"/>
+                <w:sz w:val="22"/>
               </w:rPr>
               <w:t>持</w:t>
             </w:r>
@@ -770,7 +814,7 @@
               <w:rPr>
                 <w:rFonts w:ascii="宋体" w:hAnsi="宋体" w:eastAsia="宋体"/>
                 <w:b/>
-                <w:sz w:val="24"/>
+                <w:sz w:val="22"/>
               </w:rPr>
               <w:t>条</w:t>
             </w:r>
@@ -781,7 +825,7 @@
               <w:rPr>
                 <w:rFonts w:ascii="宋体" w:hAnsi="宋体" w:eastAsia="宋体"/>
                 <w:b/>
-                <w:sz w:val="24"/>
+                <w:sz w:val="22"/>
               </w:rPr>
               <w:t>件</w:t>
             </w:r>
@@ -789,253 +833,14 @@
         </w:tc>
         <w:tc>
           <w:tcPr>
-            <w:tcW w:type="dxa" w:w="8899"/>
+            <w:tcW w:type="dxa" w:w="9155"/>
             <w:gridSpan w:val="5"/>
-            <w:vAlign w:val="top"/>
-          </w:tcPr>
-          <w:p>
-            <w:pPr>
-              <w:spacing w:before="0" w:after="0" w:line="300" w:lineRule="auto"/>
-              <w:jc w:val="left"/>
-            </w:pPr>
-            <w:r/>
-            <w:r>
-              <w:rPr>
-                <w:rFonts w:ascii="宋体" w:hAnsi="宋体" w:eastAsia="宋体"/>
-                <w:b w:val="0"/>
-                <w:sz w:val="20"/>
-              </w:rPr>
-              <w:t>请填写完成论文所需的研究基础、实验条件、数据资料、平台支持等。</w:t>
-            </w:r>
-            <w:r>
-              <w:br/>
-            </w:r>
-            <w:r>
-              <w:rPr>
-                <w:rFonts w:ascii="宋体" w:hAnsi="宋体" w:eastAsia="宋体"/>
-                <w:b w:val="0"/>
-                <w:sz w:val="20"/>
-              </w:rPr>
-            </w:r>
-            <w:r>
-              <w:br/>
-            </w:r>
-            <w:r>
-              <w:rPr>
-                <w:rFonts w:ascii="宋体" w:hAnsi="宋体" w:eastAsia="宋体"/>
-                <w:b w:val="0"/>
-                <w:sz w:val="20"/>
-              </w:rPr>
-            </w:r>
-            <w:r>
-              <w:br/>
-            </w:r>
-            <w:r>
-              <w:rPr>
-                <w:rFonts w:ascii="宋体" w:hAnsi="宋体" w:eastAsia="宋体"/>
-                <w:b w:val="0"/>
-                <w:sz w:val="20"/>
-              </w:rPr>
-            </w:r>
-            <w:r>
-              <w:br/>
-            </w:r>
-            <w:r>
-              <w:rPr>
-                <w:rFonts w:ascii="宋体" w:hAnsi="宋体" w:eastAsia="宋体"/>
-                <w:b w:val="0"/>
-                <w:sz w:val="20"/>
-              </w:rPr>
-            </w:r>
-            <w:r>
-              <w:br/>
-            </w:r>
-            <w:r>
-              <w:rPr>
-                <w:rFonts w:ascii="宋体" w:hAnsi="宋体" w:eastAsia="宋体"/>
-                <w:b w:val="0"/>
-                <w:sz w:val="20"/>
-              </w:rPr>
-            </w:r>
-            <w:r>
-              <w:br/>
-            </w:r>
-            <w:r>
-              <w:rPr>
-                <w:rFonts w:ascii="宋体" w:hAnsi="宋体" w:eastAsia="宋体"/>
-                <w:b w:val="0"/>
-                <w:sz w:val="20"/>
-              </w:rPr>
-            </w:r>
-            <w:r>
-              <w:br/>
-            </w:r>
-            <w:r>
-              <w:rPr>
-                <w:rFonts w:ascii="宋体" w:hAnsi="宋体" w:eastAsia="宋体"/>
-                <w:b w:val="0"/>
-                <w:sz w:val="20"/>
-              </w:rPr>
-            </w:r>
-            <w:r>
-              <w:br/>
-            </w:r>
-            <w:r>
-              <w:rPr>
-                <w:rFonts w:ascii="宋体" w:hAnsi="宋体" w:eastAsia="宋体"/>
-                <w:b w:val="0"/>
-                <w:sz w:val="20"/>
-              </w:rPr>
-            </w:r>
-            <w:r>
-              <w:br/>
-            </w:r>
-            <w:r>
-              <w:rPr>
-                <w:rFonts w:ascii="宋体" w:hAnsi="宋体" w:eastAsia="宋体"/>
-                <w:b w:val="0"/>
-                <w:sz w:val="20"/>
-              </w:rPr>
-            </w:r>
-            <w:r>
-              <w:br/>
-            </w:r>
-            <w:r>
-              <w:rPr>
-                <w:rFonts w:ascii="宋体" w:hAnsi="宋体" w:eastAsia="宋体"/>
-                <w:b w:val="0"/>
-                <w:sz w:val="20"/>
-              </w:rPr>
-            </w:r>
-            <w:r>
-              <w:br/>
-            </w:r>
-            <w:r>
-              <w:rPr>
-                <w:rFonts w:ascii="宋体" w:hAnsi="宋体" w:eastAsia="宋体"/>
-                <w:b w:val="0"/>
-                <w:sz w:val="20"/>
-              </w:rPr>
-            </w:r>
-          </w:p>
-        </w:tc>
-      </w:tr>
-      <w:tr>
-        <w:trPr>
-          <w:trHeight w:val="680" w:hRule="atLeast"/>
-        </w:trPr>
-        <w:tc>
-          <w:tcPr>
-            <w:tcW w:type="dxa" w:w="1020"/>
             <w:vAlign w:val="center"/>
           </w:tcPr>
           <w:p>
             <w:pPr>
-              <w:spacing w:before="0" w:after="0" w:line="300" w:lineRule="auto"/>
-              <w:jc w:val="center"/>
-            </w:pPr>
-            <w:r/>
-            <w:r>
-              <w:rPr>
-                <w:rFonts w:ascii="宋体" w:hAnsi="宋体" w:eastAsia="宋体"/>
-                <w:b/>
-                <w:sz w:val="24"/>
-              </w:rPr>
-              <w:t>指导</w:t>
-            </w:r>
-            <w:r>
-              <w:br/>
-            </w:r>
-            <w:r>
-              <w:rPr>
-                <w:rFonts w:ascii="宋体" w:hAnsi="宋体" w:eastAsia="宋体"/>
-                <w:b/>
-                <w:sz w:val="24"/>
-              </w:rPr>
-              <w:t>教师</w:t>
-            </w:r>
-            <w:r>
-              <w:br/>
-            </w:r>
-            <w:r>
-              <w:rPr>
-                <w:rFonts w:ascii="宋体" w:hAnsi="宋体" w:eastAsia="宋体"/>
-                <w:b/>
-                <w:sz w:val="24"/>
-              </w:rPr>
-              <w:t>意见</w:t>
-            </w:r>
-          </w:p>
-        </w:tc>
-        <w:tc>
-          <w:tcPr>
-            <w:tcW w:type="dxa" w:w="8899"/>
-            <w:gridSpan w:val="5"/>
-            <w:vAlign w:val="top"/>
-          </w:tcPr>
-          <w:p>
-            <w:pPr>
-              <w:spacing w:before="0" w:after="0" w:line="300" w:lineRule="auto"/>
+              <w:spacing w:before="0" w:after="0" w:line="276" w:lineRule="auto"/>
               <w:jc w:val="left"/>
-            </w:pPr>
-            <w:r/>
-            <w:r>
-              <w:rPr>
-                <w:rFonts w:ascii="宋体" w:hAnsi="宋体" w:eastAsia="宋体"/>
-                <w:b w:val="0"/>
-                <w:sz w:val="20"/>
-              </w:rPr>
-              <w:t>请填写指导教师意见。</w:t>
-            </w:r>
-          </w:p>
-        </w:tc>
-      </w:tr>
-      <w:tr>
-        <w:trPr>
-          <w:trHeight w:val="2154" w:hRule="atLeast"/>
-        </w:trPr>
-        <w:tc>
-          <w:tcPr>
-            <w:tcW w:type="dxa" w:w="1020"/>
-            <w:vAlign w:val="center"/>
-          </w:tcPr>
-          <w:p>
-            <w:pPr>
-              <w:spacing w:before="0" w:after="0" w:line="300" w:lineRule="auto"/>
-              <w:jc w:val="center"/>
-            </w:pPr>
-            <w:r/>
-            <w:r>
-              <w:rPr>
-                <w:rFonts w:ascii="宋体" w:hAnsi="宋体" w:eastAsia="宋体"/>
-                <w:b/>
-                <w:sz w:val="24"/>
-              </w:rPr>
-              <w:t>签名</w:t>
-            </w:r>
-            <w:r>
-              <w:br/>
-            </w:r>
-            <w:r>
-              <w:rPr>
-                <w:rFonts w:ascii="宋体" w:hAnsi="宋体" w:eastAsia="宋体"/>
-                <w:b/>
-                <w:sz w:val="24"/>
-              </w:rPr>
-              <w:t>日期</w:t>
-            </w:r>
-          </w:p>
-        </w:tc>
-        <w:tc>
-          <w:tcPr>
-            <w:tcW w:type="dxa" w:w="8899"/>
-            <w:gridSpan w:val="5"/>
-            <w:vAlign w:val="bottom"/>
-          </w:tcPr>
-          <w:p>
-            <w:pPr>
-              <w:spacing w:before="0" w:after="0" w:line="300" w:lineRule="auto"/>
-              <w:jc w:val="right"/>
             </w:pPr>
             <w:r/>
             <w:r>
@@ -1044,62 +849,78 @@
                 <w:b w:val="0"/>
                 <w:sz w:val="22"/>
               </w:rPr>
-              <w:t>指导教师签名：                年    月    日</w:t>
+            </w:r>
+          </w:p>
+          <w:p>
+            <w:pPr>
+              <w:spacing w:before="0" w:after="0" w:line="276" w:lineRule="auto"/>
+              <w:jc w:val="left"/>
+            </w:pPr>
+            <w:r/>
+            <w:r>
+              <w:rPr>
+                <w:rFonts w:ascii="宋体" w:hAnsi="宋体" w:eastAsia="宋体"/>
+                <w:b w:val="0"/>
+                <w:sz w:val="22"/>
+              </w:rPr>
+            </w:r>
+          </w:p>
+          <w:p>
+            <w:pPr>
+              <w:spacing w:before="0" w:after="0" w:line="276" w:lineRule="auto"/>
+              <w:jc w:val="left"/>
+            </w:pPr>
+            <w:r/>
+            <w:r>
+              <w:rPr>
+                <w:rFonts w:ascii="宋体" w:hAnsi="宋体" w:eastAsia="宋体"/>
+                <w:b w:val="0"/>
+                <w:sz w:val="22"/>
+              </w:rPr>
+            </w:r>
+          </w:p>
+          <w:p>
+            <w:pPr>
+              <w:spacing w:before="0" w:after="0" w:line="276" w:lineRule="auto"/>
+              <w:jc w:val="left"/>
+            </w:pPr>
+            <w:r/>
+            <w:r>
+              <w:rPr>
+                <w:rFonts w:ascii="宋体" w:hAnsi="宋体" w:eastAsia="宋体"/>
+                <w:b w:val="0"/>
+                <w:sz w:val="22"/>
+              </w:rPr>
+            </w:r>
+          </w:p>
+          <w:p>
+            <w:pPr>
+              <w:spacing w:before="0" w:after="0" w:line="276" w:lineRule="auto"/>
+              <w:jc w:val="left"/>
+            </w:pPr>
+            <w:r/>
+            <w:r>
+              <w:rPr>
+                <w:rFonts w:ascii="宋体" w:hAnsi="宋体" w:eastAsia="宋体"/>
+                <w:b w:val="0"/>
+                <w:sz w:val="22"/>
+              </w:rPr>
             </w:r>
           </w:p>
         </w:tc>
       </w:tr>
-    </w:tbl>
-    <w:p>
-      <w:r>
-        <w:br w:type="page"/>
-      </w:r>
-    </w:p>
-    <w:p>
-      <w:pPr>
-        <w:spacing w:before="0" w:after="200"/>
-        <w:jc w:val="center"/>
-      </w:pPr>
-      <w:r>
-        <w:rPr>
-          <w:rFonts w:ascii="黑体" w:hAnsi="黑体" w:eastAsia="黑体"/>
-          <w:b/>
-          <w:sz w:val="36"/>
-        </w:rPr>
-        <w:t>任务书（续）</w:t>
-      </w:r>
-    </w:p>
-    <w:tbl>
-      <w:tblPr>
-        <w:tblW w:type="auto" w:w="0"/>
-        <w:jc w:val="center"/>
-        <w:tblLayout w:type="fixed"/>
-        <w:tblLook w:firstColumn="1" w:firstRow="1" w:lastColumn="0" w:lastRow="0" w:noHBand="0" w:noVBand="1" w:val="04A0"/>
-        <w:tblBorders>
-          <w:top w:val="single" w:sz="12" w:space="0" w:color="000000"/>
-          <w:left w:val="single" w:sz="12" w:space="0" w:color="000000"/>
-          <w:bottom w:val="single" w:sz="12" w:space="0" w:color="000000"/>
-          <w:right w:val="single" w:sz="12" w:space="0" w:color="000000"/>
-          <w:insideH w:val="single" w:sz="12" w:space="0" w:color="000000"/>
-          <w:insideV w:val="single" w:sz="12" w:space="0" w:color="000000"/>
-        </w:tblBorders>
-      </w:tblPr>
-      <w:tblGrid>
-        <w:gridCol w:w="4933"/>
-        <w:gridCol w:w="4933"/>
-      </w:tblGrid>
       <w:tr>
         <w:trPr>
-          <w:trHeight w:val="4819" w:hRule="atLeast"/>
+          <w:trHeight w:val="3061" w:hRule="atLeast"/>
         </w:trPr>
         <w:tc>
           <w:tcPr>
-            <w:tcW w:type="dxa" w:w="1360"/>
+            <w:tcW w:type="dxa" w:w="878"/>
             <w:vAlign w:val="center"/>
           </w:tcPr>
           <w:p>
             <w:pPr>
-              <w:spacing w:before="0" w:after="0" w:line="300" w:lineRule="auto"/>
+              <w:spacing w:before="0" w:after="0" w:line="240" w:lineRule="auto"/>
               <w:jc w:val="center"/>
             </w:pPr>
             <w:r/>
@@ -1107,7 +928,7 @@
               <w:rPr>
                 <w:rFonts w:ascii="宋体" w:hAnsi="宋体" w:eastAsia="宋体"/>
                 <w:b/>
-                <w:sz w:val="24"/>
+                <w:sz w:val="22"/>
               </w:rPr>
               <w:t>主</w:t>
             </w:r>
@@ -1118,7 +939,7 @@
               <w:rPr>
                 <w:rFonts w:ascii="宋体" w:hAnsi="宋体" w:eastAsia="宋体"/>
                 <w:b/>
-                <w:sz w:val="24"/>
+                <w:sz w:val="22"/>
               </w:rPr>
               <w:t>要</w:t>
             </w:r>
@@ -1129,7 +950,7 @@
               <w:rPr>
                 <w:rFonts w:ascii="宋体" w:hAnsi="宋体" w:eastAsia="宋体"/>
                 <w:b/>
-                <w:sz w:val="24"/>
+                <w:sz w:val="22"/>
               </w:rPr>
               <w:t>参</w:t>
             </w:r>
@@ -1140,7 +961,7 @@
               <w:rPr>
                 <w:rFonts w:ascii="宋体" w:hAnsi="宋体" w:eastAsia="宋体"/>
                 <w:b/>
-                <w:sz w:val="24"/>
+                <w:sz w:val="22"/>
               </w:rPr>
               <w:t>考</w:t>
             </w:r>
@@ -1151,7 +972,7 @@
               <w:rPr>
                 <w:rFonts w:ascii="宋体" w:hAnsi="宋体" w:eastAsia="宋体"/>
                 <w:b/>
-                <w:sz w:val="24"/>
+                <w:sz w:val="22"/>
               </w:rPr>
               <w:t>文</w:t>
             </w:r>
@@ -1162,7 +983,7 @@
               <w:rPr>
                 <w:rFonts w:ascii="宋体" w:hAnsi="宋体" w:eastAsia="宋体"/>
                 <w:b/>
-                <w:sz w:val="24"/>
+                <w:sz w:val="22"/>
               </w:rPr>
               <w:t>献</w:t>
             </w:r>
@@ -1170,12 +991,13 @@
         </w:tc>
         <w:tc>
           <w:tcPr>
-            <w:tcW w:type="dxa" w:w="8391"/>
-            <w:vAlign w:val="top"/>
+            <w:tcW w:type="dxa" w:w="9155"/>
+            <w:gridSpan w:val="5"/>
+            <w:vAlign w:val="center"/>
           </w:tcPr>
           <w:p>
             <w:pPr>
-              <w:spacing w:before="0" w:after="0" w:line="300" w:lineRule="auto"/>
+              <w:spacing w:before="0" w:after="0" w:line="276" w:lineRule="auto"/>
               <w:jc w:val="left"/>
             </w:pPr>
             <w:r/>
@@ -1183,118 +1005,63 @@
               <w:rPr>
                 <w:rFonts w:ascii="宋体" w:hAnsi="宋体" w:eastAsia="宋体"/>
                 <w:b w:val="0"/>
-                <w:sz w:val="20"/>
+                <w:sz w:val="22"/>
               </w:rPr>
-              <w:t>请填写主要参考文献。</w:t>
             </w:r>
-            <w:r>
-              <w:br/>
-            </w:r>
+          </w:p>
+          <w:p>
+            <w:pPr>
+              <w:spacing w:before="0" w:after="0" w:line="276" w:lineRule="auto"/>
+              <w:jc w:val="left"/>
+            </w:pPr>
+            <w:r/>
             <w:r>
               <w:rPr>
                 <w:rFonts w:ascii="宋体" w:hAnsi="宋体" w:eastAsia="宋体"/>
                 <w:b w:val="0"/>
-                <w:sz w:val="20"/>
+                <w:sz w:val="22"/>
               </w:rPr>
             </w:r>
-            <w:r>
-              <w:br/>
-            </w:r>
+          </w:p>
+          <w:p>
+            <w:pPr>
+              <w:spacing w:before="0" w:after="0" w:line="276" w:lineRule="auto"/>
+              <w:jc w:val="left"/>
+            </w:pPr>
+            <w:r/>
             <w:r>
               <w:rPr>
                 <w:rFonts w:ascii="宋体" w:hAnsi="宋体" w:eastAsia="宋体"/>
                 <w:b w:val="0"/>
-                <w:sz w:val="20"/>
+                <w:sz w:val="22"/>
               </w:rPr>
             </w:r>
-            <w:r>
-              <w:br/>
-            </w:r>
+          </w:p>
+          <w:p>
+            <w:pPr>
+              <w:spacing w:before="0" w:after="0" w:line="276" w:lineRule="auto"/>
+              <w:jc w:val="left"/>
+            </w:pPr>
+            <w:r/>
             <w:r>
               <w:rPr>
                 <w:rFonts w:ascii="宋体" w:hAnsi="宋体" w:eastAsia="宋体"/>
                 <w:b w:val="0"/>
-                <w:sz w:val="20"/>
+                <w:sz w:val="22"/>
               </w:rPr>
             </w:r>
-            <w:r>
-              <w:br/>
-            </w:r>
+          </w:p>
+          <w:p>
+            <w:pPr>
+              <w:spacing w:before="0" w:after="0" w:line="276" w:lineRule="auto"/>
+              <w:jc w:val="left"/>
+            </w:pPr>
+            <w:r/>
             <w:r>
               <w:rPr>
                 <w:rFonts w:ascii="宋体" w:hAnsi="宋体" w:eastAsia="宋体"/>
                 <w:b w:val="0"/>
-                <w:sz w:val="20"/>
-              </w:rPr>
-            </w:r>
-            <w:r>
-              <w:br/>
-            </w:r>
-            <w:r>
-              <w:rPr>
-                <w:rFonts w:ascii="宋体" w:hAnsi="宋体" w:eastAsia="宋体"/>
-                <w:b w:val="0"/>
-                <w:sz w:val="20"/>
-              </w:rPr>
-            </w:r>
-            <w:r>
-              <w:br/>
-            </w:r>
-            <w:r>
-              <w:rPr>
-                <w:rFonts w:ascii="宋体" w:hAnsi="宋体" w:eastAsia="宋体"/>
-                <w:b w:val="0"/>
-                <w:sz w:val="20"/>
-              </w:rPr>
-            </w:r>
-            <w:r>
-              <w:br/>
-            </w:r>
-            <w:r>
-              <w:rPr>
-                <w:rFonts w:ascii="宋体" w:hAnsi="宋体" w:eastAsia="宋体"/>
-                <w:b w:val="0"/>
-                <w:sz w:val="20"/>
-              </w:rPr>
-            </w:r>
-            <w:r>
-              <w:br/>
-            </w:r>
-            <w:r>
-              <w:rPr>
-                <w:rFonts w:ascii="宋体" w:hAnsi="宋体" w:eastAsia="宋体"/>
-                <w:b w:val="0"/>
-                <w:sz w:val="20"/>
-              </w:rPr>
-            </w:r>
-            <w:r>
-              <w:br/>
-            </w:r>
-            <w:r>
-              <w:rPr>
-                <w:rFonts w:ascii="宋体" w:hAnsi="宋体" w:eastAsia="宋体"/>
-                <w:b w:val="0"/>
-                <w:sz w:val="20"/>
-              </w:rPr>
-            </w:r>
-            <w:r>
-              <w:br/>
-            </w:r>
-            <w:r>
-              <w:rPr>
-                <w:rFonts w:ascii="宋体" w:hAnsi="宋体" w:eastAsia="宋体"/>
-                <w:b w:val="0"/>
-                <w:sz w:val="20"/>
-              </w:rPr>
-            </w:r>
-            <w:r>
-              <w:br/>
-            </w:r>
-            <w:r>
-              <w:rPr>
-                <w:rFonts w:ascii="宋体" w:hAnsi="宋体" w:eastAsia="宋体"/>
-                <w:b w:val="0"/>
-                <w:sz w:val="20"/>
+                <w:sz w:val="22"/>
               </w:rPr>
             </w:r>
           </w:p>
@@ -1302,16 +1069,16 @@
       </w:tr>
       <w:tr>
         <w:trPr>
-          <w:trHeight w:val="4819" w:hRule="atLeast"/>
+          <w:trHeight w:val="510" w:hRule="atLeast"/>
         </w:trPr>
         <w:tc>
           <w:tcPr>
-            <w:tcW w:type="dxa" w:w="1360"/>
+            <w:tcW w:type="dxa" w:w="878"/>
             <w:vAlign w:val="center"/>
           </w:tcPr>
           <w:p>
             <w:pPr>
-              <w:spacing w:before="0" w:after="0" w:line="300" w:lineRule="auto"/>
+              <w:spacing w:before="0" w:after="0" w:line="276" w:lineRule="auto"/>
               <w:jc w:val="center"/>
             </w:pPr>
             <w:r/>
@@ -1319,208 +1086,7 @@
               <w:rPr>
                 <w:rFonts w:ascii="宋体" w:hAnsi="宋体" w:eastAsia="宋体"/>
                 <w:b/>
-                <w:sz w:val="24"/>
-              </w:rPr>
-              <w:t>进</w:t>
-            </w:r>
-            <w:r>
-              <w:br/>
-            </w:r>
-            <w:r>
-              <w:rPr>
-                <w:rFonts w:ascii="宋体" w:hAnsi="宋体" w:eastAsia="宋体"/>
-                <w:b/>
-                <w:sz w:val="24"/>
-              </w:rPr>
-              <w:t>度</w:t>
-            </w:r>
-            <w:r>
-              <w:br/>
-            </w:r>
-            <w:r>
-              <w:rPr>
-                <w:rFonts w:ascii="宋体" w:hAnsi="宋体" w:eastAsia="宋体"/>
-                <w:b/>
-                <w:sz w:val="24"/>
-              </w:rPr>
-              <w:t>安</w:t>
-            </w:r>
-            <w:r>
-              <w:br/>
-            </w:r>
-            <w:r>
-              <w:rPr>
-                <w:rFonts w:ascii="宋体" w:hAnsi="宋体" w:eastAsia="宋体"/>
-                <w:b/>
-                <w:sz w:val="24"/>
-              </w:rPr>
-              <w:t>排</w:t>
-            </w:r>
-          </w:p>
-        </w:tc>
-        <w:tc>
-          <w:tcPr>
-            <w:tcW w:type="dxa" w:w="8391"/>
-            <w:vAlign w:val="top"/>
-          </w:tcPr>
-          <w:p>
-            <w:pPr>
-              <w:spacing w:before="0" w:after="0" w:line="300" w:lineRule="auto"/>
-              <w:jc w:val="left"/>
-            </w:pPr>
-            <w:r/>
-            <w:r>
-              <w:rPr>
-                <w:rFonts w:ascii="宋体" w:hAnsi="宋体" w:eastAsia="宋体"/>
-                <w:b w:val="0"/>
-                <w:sz w:val="20"/>
-              </w:rPr>
-              <w:t>请按时间节点填写论文工作进度安排。</w:t>
-            </w:r>
-            <w:r>
-              <w:br/>
-            </w:r>
-            <w:r>
-              <w:rPr>
-                <w:rFonts w:ascii="宋体" w:hAnsi="宋体" w:eastAsia="宋体"/>
-                <w:b w:val="0"/>
-                <w:sz w:val="20"/>
-              </w:rPr>
-            </w:r>
-            <w:r>
-              <w:br/>
-            </w:r>
-            <w:r>
-              <w:rPr>
-                <w:rFonts w:ascii="宋体" w:hAnsi="宋体" w:eastAsia="宋体"/>
-                <w:b w:val="0"/>
-                <w:sz w:val="20"/>
-              </w:rPr>
-            </w:r>
-            <w:r>
-              <w:br/>
-            </w:r>
-            <w:r>
-              <w:rPr>
-                <w:rFonts w:ascii="宋体" w:hAnsi="宋体" w:eastAsia="宋体"/>
-                <w:b w:val="0"/>
-                <w:sz w:val="20"/>
-              </w:rPr>
-            </w:r>
-            <w:r>
-              <w:br/>
-            </w:r>
-            <w:r>
-              <w:rPr>
-                <w:rFonts w:ascii="宋体" w:hAnsi="宋体" w:eastAsia="宋体"/>
-                <w:b w:val="0"/>
-                <w:sz w:val="20"/>
-              </w:rPr>
-            </w:r>
-            <w:r>
-              <w:br/>
-            </w:r>
-            <w:r>
-              <w:rPr>
-                <w:rFonts w:ascii="宋体" w:hAnsi="宋体" w:eastAsia="宋体"/>
-                <w:b w:val="0"/>
-                <w:sz w:val="20"/>
-              </w:rPr>
-            </w:r>
-            <w:r>
-              <w:br/>
-            </w:r>
-            <w:r>
-              <w:rPr>
-                <w:rFonts w:ascii="宋体" w:hAnsi="宋体" w:eastAsia="宋体"/>
-                <w:b w:val="0"/>
-                <w:sz w:val="20"/>
-              </w:rPr>
-            </w:r>
-            <w:r>
-              <w:br/>
-            </w:r>
-            <w:r>
-              <w:rPr>
-                <w:rFonts w:ascii="宋体" w:hAnsi="宋体" w:eastAsia="宋体"/>
-                <w:b w:val="0"/>
-                <w:sz w:val="20"/>
-              </w:rPr>
-            </w:r>
-            <w:r>
-              <w:br/>
-            </w:r>
-            <w:r>
-              <w:rPr>
-                <w:rFonts w:ascii="宋体" w:hAnsi="宋体" w:eastAsia="宋体"/>
-                <w:b w:val="0"/>
-                <w:sz w:val="20"/>
-              </w:rPr>
-            </w:r>
-            <w:r>
-              <w:br/>
-            </w:r>
-            <w:r>
-              <w:rPr>
-                <w:rFonts w:ascii="宋体" w:hAnsi="宋体" w:eastAsia="宋体"/>
-                <w:b w:val="0"/>
-                <w:sz w:val="20"/>
-              </w:rPr>
-            </w:r>
-            <w:r>
-              <w:br/>
-            </w:r>
-            <w:r>
-              <w:rPr>
-                <w:rFonts w:ascii="宋体" w:hAnsi="宋体" w:eastAsia="宋体"/>
-                <w:b w:val="0"/>
-                <w:sz w:val="20"/>
-              </w:rPr>
-            </w:r>
-            <w:r>
-              <w:br/>
-            </w:r>
-            <w:r>
-              <w:rPr>
-                <w:rFonts w:ascii="宋体" w:hAnsi="宋体" w:eastAsia="宋体"/>
-                <w:b w:val="0"/>
-                <w:sz w:val="20"/>
-              </w:rPr>
-            </w:r>
-          </w:p>
-        </w:tc>
-      </w:tr>
-      <w:tr>
-        <w:trPr>
-          <w:trHeight w:val="1417" w:hRule="atLeast"/>
-        </w:trPr>
-        <w:tc>
-          <w:tcPr>
-            <w:tcW w:type="dxa" w:w="1360"/>
-            <w:vAlign w:val="center"/>
-          </w:tcPr>
-          <w:p>
-            <w:pPr>
-              <w:spacing w:before="0" w:after="0" w:line="300" w:lineRule="auto"/>
-              <w:jc w:val="center"/>
-            </w:pPr>
-            <w:r/>
-            <w:r>
-              <w:rPr>
-                <w:rFonts w:ascii="宋体" w:hAnsi="宋体" w:eastAsia="宋体"/>
-                <w:b/>
-                <w:sz w:val="24"/>
-              </w:rPr>
-              <w:t>学生</w:t>
-            </w:r>
-            <w:r>
-              <w:br/>
-            </w:r>
-            <w:r>
-              <w:rPr>
-                <w:rFonts w:ascii="宋体" w:hAnsi="宋体" w:eastAsia="宋体"/>
-                <w:b/>
-                <w:sz w:val="24"/>
+                <w:sz w:val="22"/>
               </w:rPr>
               <w:t>签名</w:t>
             </w:r>
@@ -1528,12 +1094,13 @@
         </w:tc>
         <w:tc>
           <w:tcPr>
-            <w:tcW w:type="dxa" w:w="8391"/>
-            <w:vAlign w:val="bottom"/>
+            <w:tcW w:type="dxa" w:w="9155"/>
+            <w:gridSpan w:val="5"/>
+            <w:vAlign w:val="center"/>
           </w:tcPr>
           <w:p>
             <w:pPr>
-              <w:spacing w:before="0" w:after="0" w:line="300" w:lineRule="auto"/>
+              <w:spacing w:before="0" w:after="0" w:line="276" w:lineRule="auto"/>
               <w:jc w:val="right"/>
             </w:pPr>
             <w:r/>
@@ -1543,73 +1110,28 @@
                 <w:b w:val="0"/>
                 <w:sz w:val="22"/>
               </w:rPr>
-              <w:t>学生签名：                年    月    日</w:t>
-            </w:r>
-          </w:p>
-        </w:tc>
-      </w:tr>
-      <w:tr>
-        <w:trPr>
-          <w:trHeight w:val="1417" w:hRule="atLeast"/>
-        </w:trPr>
-        <w:tc>
-          <w:tcPr>
-            <w:tcW w:type="dxa" w:w="1360"/>
-            <w:vAlign w:val="center"/>
-          </w:tcPr>
-          <w:p>
-            <w:pPr>
-              <w:spacing w:before="0" w:after="0" w:line="300" w:lineRule="auto"/>
-              <w:jc w:val="center"/>
-            </w:pPr>
-            <w:r/>
-            <w:r>
-              <w:rPr>
-                <w:rFonts w:ascii="宋体" w:hAnsi="宋体" w:eastAsia="宋体"/>
-                <w:b/>
-                <w:sz w:val="24"/>
-              </w:rPr>
-              <w:t>学院</w:t>
-            </w:r>
-            <w:r>
-              <w:br/>
-            </w:r>
-            <w:r>
-              <w:rPr>
-                <w:rFonts w:ascii="宋体" w:hAnsi="宋体" w:eastAsia="宋体"/>
-                <w:b/>
-                <w:sz w:val="24"/>
-              </w:rPr>
-              <w:t>意见</w:t>
-            </w:r>
-          </w:p>
-        </w:tc>
-        <w:tc>
-          <w:tcPr>
-            <w:tcW w:type="dxa" w:w="8391"/>
-            <w:vAlign w:val="bottom"/>
-          </w:tcPr>
-          <w:p>
-            <w:pPr>
-              <w:spacing w:before="0" w:after="0" w:line="300" w:lineRule="auto"/>
-              <w:jc w:val="right"/>
-            </w:pPr>
-            <w:r/>
-            <w:r>
-              <w:rPr>
-                <w:rFonts w:ascii="宋体" w:hAnsi="宋体" w:eastAsia="宋体"/>
-                <w:b w:val="0"/>
-                <w:sz w:val="22"/>
-              </w:rPr>
-              <w:t>负责人签名：              年    月    日</w:t>
+              <w:t>指导教师签名：                    年    月    日</w:t>
             </w:r>
           </w:p>
         </w:tc>
       </w:tr>
     </w:tbl>
+    <w:p>
+      <w:pPr>
+        <w:spacing w:before="60" w:after="0"/>
+      </w:pPr>
+      <w:r>
+        <w:rPr>
+          <w:rFonts w:ascii="宋体" w:hAnsi="宋体" w:eastAsia="宋体"/>
+          <w:b w:val="0"/>
+          <w:sz w:val="20"/>
+        </w:rPr>
+        <w:t>注：不足部分可加页。</w:t>
+      </w:r>
+    </w:p>
     <w:sectPr>
       <w:pgSz w:w="11906" w:h="16838"/>
-      <w:pgMar w:top="907" w:right="1020" w:bottom="850" w:left="1020" w:header="454" w:footer="454" w:gutter="0"/>
+      <w:pgMar w:top="907" w:right="935" w:bottom="737" w:left="935" w:header="720" w:footer="720" w:gutter="0"/>
       <w:cols w:space="720"/>
       <w:docGrid w:linePitch="360"/>
     </w:sectPr>

</xml_diff>